<commit_message>
docs: actualiza propuesta v2 (Kit de Marca, redes, calendario y beneficios)
</commit_message>
<xml_diff>
--- a/propuesta/Propuesta_Metales_Infinity_Aimarktech.docx
+++ b/propuesta/Propuesta_Metales_Infinity_Aimarktech.docx
@@ -45,7 +45,7 @@
                 <w:color w:val="B9C6D6"/>
                 <w:sz w:val="19"/>
               </w:rPr>
-              <w:t xml:space="preserve">   ·   Sistemas digitales e IA para PyMEs</w:t>
+              <w:t xml:space="preserve">    IA · Marketing · Mentalidad empresarial</w:t>
             </w:r>
           </w:p>
           <w:p>
@@ -58,9 +58,9 @@
                 <w:b/>
                 <w:i w:val="0"/>
                 <w:color w:val="FFFFFF"/>
-                <w:sz w:val="52"/>
+                <w:sz w:val="48"/>
               </w:rPr>
-              <w:t>Propuesta de tienda en línea</w:t>
+              <w:t>Propuesta: tu marca y tu tienda en línea</w:t>
             </w:r>
           </w:p>
           <w:p>
@@ -73,9 +73,9 @@
                 <w:b/>
                 <w:i w:val="0"/>
                 <w:color w:val="FFCE00"/>
-                <w:sz w:val="52"/>
+                <w:sz w:val="48"/>
               </w:rPr>
-              <w:t>para Metales Infinity</w:t>
+              <w:t>Metales Infinity</w:t>
             </w:r>
           </w:p>
           <w:p>
@@ -90,7 +90,7 @@
                 <w:color w:val="D7E4F0"/>
                 <w:sz w:val="23"/>
               </w:rPr>
-              <w:t>Tu propia tienda bilingüe (español / inglés) para vender con orden, cobrar con anticipo y depender menos del día a día.</w:t>
+              <w:t>Una tienda propia bilingüe (español / inglés) para vender con orden, cobrar con anticipo y depender menos del día a día.</w:t>
             </w:r>
           </w:p>
         </w:tc>
@@ -156,7 +156,7 @@
                 <w:color w:val="0E1B2C"/>
                 <w:sz w:val="21"/>
               </w:rPr>
-              <w:t xml:space="preserve">Elaborado por:  </w:t>
+              <w:t xml:space="preserve">Preparado por:  </w:t>
             </w:r>
             <w:r>
               <w:rPr>
@@ -191,7 +191,58 @@
                 <w:color w:val="46566B"/>
                 <w:sz w:val="21"/>
               </w:rPr>
-              <w:t>Septiembre 2026</w:t>
+              <w:t>__________________     ·     Septiembre 2026</w:t>
+            </w:r>
+          </w:p>
+        </w:tc>
+      </w:tr>
+    </w:tbl>
+    <w:tbl>
+      <w:tblPr>
+        <w:tblW w:type="auto" w:w="0"/>
+        <w:tblLook w:firstColumn="1" w:firstRow="1" w:lastColumn="0" w:lastRow="0" w:noHBand="0" w:noVBand="1" w:val="04A0"/>
+      </w:tblPr>
+      <w:tblGrid>
+        <w:gridCol w:w="9972"/>
+      </w:tblGrid>
+      <w:tr>
+        <w:tc>
+          <w:tcPr>
+            <w:tcW w:type="dxa" w:w="9972"/>
+            <w:shd w:val="clear" w:color="auto" w:fill="F4F8FD"/>
+            <w:tcMar>
+              <w:top w:w="160" w:type="dxa"/>
+              <w:bottom w:w="160" w:type="dxa"/>
+              <w:start w:w="220" w:type="dxa"/>
+              <w:end w:w="220" w:type="dxa"/>
+              <w:left w:w="220" w:type="dxa"/>
+              <w:right w:w="220" w:type="dxa"/>
+            </w:tcMar>
+            <w:tcBorders>
+              <w:top w:val="single" w:sz="20" w:space="0" w:color="0A74DA"/>
+            </w:tcBorders>
+          </w:tcPr>
+          <w:p>
+            <w:r/>
+            <w:r>
+              <w:rPr>
+                <w:rFonts w:ascii="Montserrat" w:hAnsi="Montserrat" w:cs="Montserrat"/>
+                <w:b/>
+                <w:i w:val="0"/>
+                <w:color w:val="0A74DA"/>
+                <w:sz w:val="22"/>
+              </w:rPr>
+              <w:t xml:space="preserve">Antes de empezar.  </w:t>
+            </w:r>
+            <w:r>
+              <w:rPr>
+                <w:rFonts w:ascii="Lato" w:hAnsi="Lato" w:cs="Lato"/>
+                <w:b w:val="0"/>
+                <w:i w:val="0"/>
+                <w:color w:val="46566B"/>
+                <w:sz w:val="21"/>
+              </w:rPr>
+              <w:t>Gael, esto no es una lista de servicios ni promesas de “posts bonitos”. Es el resultado de mirar tu negocio con tus propios números. Tu negocio no está mal: tienes lo más difícil —buen producto, clientes que regresan y calidad que te distingue—. Lo que falta es un sistema para que no todo dependa de ti. Eso es lo que te proponemos, con honestidad y sin ofrecerte lo que no se pueda cumplir.</w:t>
             </w:r>
           </w:p>
         </w:tc>
@@ -199,24 +250,8 @@
     </w:tbl>
     <w:p>
       <w:pPr>
-        <w:spacing w:after="120" w:before="200" w:line="276" w:lineRule="auto"/>
-        <w:jc w:val="center"/>
-      </w:pPr>
-      <w:r>
-        <w:rPr>
-          <w:rFonts w:ascii="Lato" w:hAnsi="Lato" w:cs="Lato"/>
-          <w:b w:val="0"/>
-          <w:i/>
-          <w:color w:val="46566B"/>
-          <w:sz w:val="19"/>
-        </w:rPr>
-        <w:t>Diagnóstico + propuesta. Sin promesas mágicas: el aumento de ventas se mide después de lanzar, con tus números reales.</w:t>
-      </w:r>
-    </w:p>
-    <w:p>
-      <w:pPr>
         <w:keepNext/>
-        <w:spacing w:before="320" w:after="160"/>
+        <w:spacing w:before="300" w:after="140"/>
         <w:pBdr>
           <w:bottom w:val="single" w:sz="10" w:space="4" w:color="E3EBF4"/>
         </w:pBdr>
@@ -227,7 +262,7 @@
           <w:b/>
           <w:i w:val="0"/>
           <w:color w:val="00C2FF"/>
-          <w:sz w:val="28"/>
+          <w:sz w:val="27"/>
         </w:rPr>
         <w:t xml:space="preserve">1  </w:t>
       </w:r>
@@ -237,7 +272,7 @@
           <w:b/>
           <w:i w:val="0"/>
           <w:color w:val="0A74DA"/>
-          <w:sz w:val="28"/>
+          <w:sz w:val="27"/>
         </w:rPr>
         <w:t>En corto</w:t>
       </w:r>
@@ -254,7 +289,7 @@
           <w:color w:val="46566B"/>
           <w:sz w:val="21"/>
         </w:rPr>
-        <w:t>Metales Infinity fabrica sellos y figuras vaqueras personalizadas de calidad, y hoy vende principalmente por Facebook y WhatsApp. Esta propuesta plantea el siguiente paso: tu propia tienda en línea, bilingüe (español e inglés), donde tus clientes vean productos y precios, puedan pedir y —cuando lo decidas— pagar en línea con un anticipo.</w:t>
+        <w:t>Metales Infinity fabrica sellos y figuras vaqueras personalizadas de calidad, y hoy vende principalmente por Facebook y WhatsApp. El siguiente paso es tu propia tienda en línea, bilingüe, donde tus clientes vean productos y precios, puedan pedir y —cuando lo decidas— pagar en línea con un anticipo.</w:t>
       </w:r>
     </w:p>
     <w:p>
@@ -269,13 +304,13 @@
           <w:color w:val="46566B"/>
           <w:sz w:val="21"/>
         </w:rPr>
-        <w:t>El objetivo no es prometerte un número mágico de ventas, sino darte orden: menos tiempo contestando lo mismo, menos riesgo de cancelaciones y una vitrina profesional que trabaje por ti las 24 horas, también para el mercado latino de Estados Unidos.</w:t>
+        <w:t>No te prometemos un número mágico de ventas. Buscamos orden: menos tiempo contestando lo mismo, menos riesgo de cancelaciones y una vitrina profesional que trabaje por ti las 24 horas, también para el mercado latino de Estados Unidos.</w:t>
       </w:r>
     </w:p>
     <w:p>
       <w:pPr>
         <w:keepNext/>
-        <w:spacing w:before="320" w:after="160"/>
+        <w:spacing w:before="300" w:after="140"/>
         <w:pBdr>
           <w:bottom w:val="single" w:sz="10" w:space="4" w:color="E3EBF4"/>
         </w:pBdr>
@@ -286,7 +321,7 @@
           <w:b/>
           <w:i w:val="0"/>
           <w:color w:val="00C2FF"/>
-          <w:sz w:val="28"/>
+          <w:sz w:val="27"/>
         </w:rPr>
         <w:t xml:space="preserve">2  </w:t>
       </w:r>
@@ -296,9 +331,9 @@
           <w:b/>
           <w:i w:val="0"/>
           <w:color w:val="0A74DA"/>
-          <w:sz w:val="28"/>
+          <w:sz w:val="27"/>
         </w:rPr>
-        <w:t>Diagnóstico breve (lo esencial)</w:t>
+        <w:t>Radiografía de tu negocio</w:t>
       </w:r>
     </w:p>
     <w:p>
@@ -313,7 +348,679 @@
           <w:color w:val="46566B"/>
           <w:sz w:val="21"/>
         </w:rPr>
-        <w:t>Cuatro puntos concretos que hoy frenan el crecimiento y que esta propuesta busca resolver:</w:t>
+        <w:t>Esto es lo que dicen los números que compartiste (los confirmamos y afinamos en la Etapa 1):</w:t>
+      </w:r>
+    </w:p>
+    <w:tbl>
+      <w:tblPr>
+        <w:tblW w:type="auto" w:w="0"/>
+        <w:jc w:val="center"/>
+        <w:tblLook w:firstColumn="1" w:firstRow="1" w:lastColumn="0" w:lastRow="0" w:noHBand="0" w:noVBand="1" w:val="04A0"/>
+        <w:tblBorders>
+          <w:top w:val="single" w:sz="6" w:space="0" w:color="E3EBF4"/>
+          <w:left w:val="single" w:sz="6" w:space="0" w:color="E3EBF4"/>
+          <w:bottom w:val="single" w:sz="6" w:space="0" w:color="E3EBF4"/>
+          <w:right w:val="single" w:sz="6" w:space="0" w:color="E3EBF4"/>
+          <w:insideH w:val="single" w:sz="6" w:space="0" w:color="E3EBF4"/>
+          <w:insideV w:val="single" w:sz="6" w:space="0" w:color="E3EBF4"/>
+        </w:tblBorders>
+      </w:tblPr>
+      <w:tblGrid>
+        <w:gridCol w:w="3324"/>
+        <w:gridCol w:w="3324"/>
+        <w:gridCol w:w="3324"/>
+      </w:tblGrid>
+      <w:tr>
+        <w:tc>
+          <w:tcPr>
+            <w:tcW w:type="dxa" w:w="2194"/>
+            <w:shd w:val="clear" w:color="auto" w:fill="0A74DA"/>
+            <w:tcMar>
+              <w:top w:w="100" w:type="dxa"/>
+              <w:bottom w:w="100" w:type="dxa"/>
+              <w:start w:w="140" w:type="dxa"/>
+              <w:end w:w="140" w:type="dxa"/>
+              <w:left w:w="140" w:type="dxa"/>
+              <w:right w:w="140" w:type="dxa"/>
+            </w:tcMar>
+          </w:tcPr>
+          <w:p>
+            <w:r/>
+            <w:r>
+              <w:rPr>
+                <w:rFonts w:ascii="Montserrat" w:hAnsi="Montserrat" w:cs="Montserrat"/>
+                <w:b/>
+                <w:i w:val="0"/>
+                <w:color w:val="FFFFFF"/>
+                <w:sz w:val="19"/>
+              </w:rPr>
+              <w:t>Indicador</w:t>
+            </w:r>
+          </w:p>
+        </w:tc>
+        <w:tc>
+          <w:tcPr>
+            <w:tcW w:type="dxa" w:w="2992"/>
+            <w:shd w:val="clear" w:color="auto" w:fill="0A74DA"/>
+            <w:tcMar>
+              <w:top w:w="100" w:type="dxa"/>
+              <w:bottom w:w="100" w:type="dxa"/>
+              <w:start w:w="140" w:type="dxa"/>
+              <w:end w:w="140" w:type="dxa"/>
+              <w:left w:w="140" w:type="dxa"/>
+              <w:right w:w="140" w:type="dxa"/>
+            </w:tcMar>
+          </w:tcPr>
+          <w:p>
+            <w:r/>
+            <w:r>
+              <w:rPr>
+                <w:rFonts w:ascii="Montserrat" w:hAnsi="Montserrat" w:cs="Montserrat"/>
+                <w:b/>
+                <w:i w:val="0"/>
+                <w:color w:val="FFFFFF"/>
+                <w:sz w:val="19"/>
+              </w:rPr>
+              <w:t>Hoy (según tus datos)</w:t>
+            </w:r>
+          </w:p>
+        </w:tc>
+        <w:tc>
+          <w:tcPr>
+            <w:tcW w:type="dxa" w:w="4787"/>
+            <w:shd w:val="clear" w:color="auto" w:fill="0A74DA"/>
+            <w:tcMar>
+              <w:top w:w="100" w:type="dxa"/>
+              <w:bottom w:w="100" w:type="dxa"/>
+              <w:start w:w="140" w:type="dxa"/>
+              <w:end w:w="140" w:type="dxa"/>
+              <w:left w:w="140" w:type="dxa"/>
+              <w:right w:w="140" w:type="dxa"/>
+            </w:tcMar>
+          </w:tcPr>
+          <w:p>
+            <w:r/>
+            <w:r>
+              <w:rPr>
+                <w:rFonts w:ascii="Montserrat" w:hAnsi="Montserrat" w:cs="Montserrat"/>
+                <w:b/>
+                <w:i w:val="0"/>
+                <w:color w:val="FFFFFF"/>
+                <w:sz w:val="19"/>
+              </w:rPr>
+              <w:t>Qué significa</w:t>
+            </w:r>
+          </w:p>
+        </w:tc>
+      </w:tr>
+      <w:tr>
+        <w:tc>
+          <w:tcPr>
+            <w:tcW w:type="dxa" w:w="2194"/>
+            <w:shd w:val="clear" w:color="auto" w:fill="FFFFFF"/>
+            <w:tcMar>
+              <w:top w:w="100" w:type="dxa"/>
+              <w:bottom w:w="100" w:type="dxa"/>
+              <w:start w:w="140" w:type="dxa"/>
+              <w:end w:w="140" w:type="dxa"/>
+              <w:left w:w="140" w:type="dxa"/>
+              <w:right w:w="140" w:type="dxa"/>
+            </w:tcMar>
+          </w:tcPr>
+          <w:p>
+            <w:r/>
+            <w:r>
+              <w:rPr>
+                <w:rFonts w:ascii="Lato" w:hAnsi="Lato" w:cs="Lato"/>
+                <w:b/>
+                <w:i w:val="0"/>
+                <w:color w:val="0E1B2C"/>
+                <w:sz w:val="19"/>
+              </w:rPr>
+              <w:t>Capacidad usada</w:t>
+            </w:r>
+          </w:p>
+        </w:tc>
+        <w:tc>
+          <w:tcPr>
+            <w:tcW w:type="dxa" w:w="2992"/>
+            <w:shd w:val="clear" w:color="auto" w:fill="FFFFFF"/>
+            <w:tcMar>
+              <w:top w:w="100" w:type="dxa"/>
+              <w:bottom w:w="100" w:type="dxa"/>
+              <w:start w:w="140" w:type="dxa"/>
+              <w:end w:w="140" w:type="dxa"/>
+              <w:left w:w="140" w:type="dxa"/>
+              <w:right w:w="140" w:type="dxa"/>
+            </w:tcMar>
+          </w:tcPr>
+          <w:p>
+            <w:r/>
+            <w:r>
+              <w:rPr>
+                <w:rFonts w:ascii="Lato" w:hAnsi="Lato" w:cs="Lato"/>
+                <w:b w:val="0"/>
+                <w:i w:val="0"/>
+                <w:color w:val="46566B"/>
+                <w:sz w:val="19"/>
+              </w:rPr>
+              <w:t>40 de 120 piezas/día (~33%)</w:t>
+            </w:r>
+          </w:p>
+        </w:tc>
+        <w:tc>
+          <w:tcPr>
+            <w:tcW w:type="dxa" w:w="4787"/>
+            <w:shd w:val="clear" w:color="auto" w:fill="FFFFFF"/>
+            <w:tcMar>
+              <w:top w:w="100" w:type="dxa"/>
+              <w:bottom w:w="100" w:type="dxa"/>
+              <w:start w:w="140" w:type="dxa"/>
+              <w:end w:w="140" w:type="dxa"/>
+              <w:left w:w="140" w:type="dxa"/>
+              <w:right w:w="140" w:type="dxa"/>
+            </w:tcMar>
+          </w:tcPr>
+          <w:p>
+            <w:r/>
+            <w:r>
+              <w:rPr>
+                <w:rFonts w:ascii="Lato" w:hAnsi="Lato" w:cs="Lato"/>
+                <w:b w:val="0"/>
+                <w:i w:val="0"/>
+                <w:color w:val="46566B"/>
+                <w:sz w:val="19"/>
+              </w:rPr>
+              <w:t>Capacidad instalada para crecer sin comprar maquinaria</w:t>
+            </w:r>
+          </w:p>
+        </w:tc>
+      </w:tr>
+      <w:tr>
+        <w:tc>
+          <w:tcPr>
+            <w:tcW w:type="dxa" w:w="2194"/>
+            <w:shd w:val="clear" w:color="auto" w:fill="F4F8FD"/>
+            <w:tcMar>
+              <w:top w:w="100" w:type="dxa"/>
+              <w:bottom w:w="100" w:type="dxa"/>
+              <w:start w:w="140" w:type="dxa"/>
+              <w:end w:w="140" w:type="dxa"/>
+              <w:left w:w="140" w:type="dxa"/>
+              <w:right w:w="140" w:type="dxa"/>
+            </w:tcMar>
+          </w:tcPr>
+          <w:p>
+            <w:r/>
+            <w:r>
+              <w:rPr>
+                <w:rFonts w:ascii="Lato" w:hAnsi="Lato" w:cs="Lato"/>
+                <w:b/>
+                <w:i w:val="0"/>
+                <w:color w:val="0E1B2C"/>
+                <w:sz w:val="19"/>
+              </w:rPr>
+              <w:t>Tiempo en atención</w:t>
+            </w:r>
+          </w:p>
+        </w:tc>
+        <w:tc>
+          <w:tcPr>
+            <w:tcW w:type="dxa" w:w="2992"/>
+            <w:shd w:val="clear" w:color="auto" w:fill="F4F8FD"/>
+            <w:tcMar>
+              <w:top w:w="100" w:type="dxa"/>
+              <w:bottom w:w="100" w:type="dxa"/>
+              <w:start w:w="140" w:type="dxa"/>
+              <w:end w:w="140" w:type="dxa"/>
+              <w:left w:w="140" w:type="dxa"/>
+              <w:right w:w="140" w:type="dxa"/>
+            </w:tcMar>
+          </w:tcPr>
+          <w:p>
+            <w:r/>
+            <w:r>
+              <w:rPr>
+                <w:rFonts w:ascii="Lato" w:hAnsi="Lato" w:cs="Lato"/>
+                <w:b w:val="0"/>
+                <w:i w:val="0"/>
+                <w:color w:val="46566B"/>
+                <w:sz w:val="19"/>
+              </w:rPr>
+              <w:t>~6 h/día en mensajes</w:t>
+            </w:r>
+          </w:p>
+        </w:tc>
+        <w:tc>
+          <w:tcPr>
+            <w:tcW w:type="dxa" w:w="4787"/>
+            <w:shd w:val="clear" w:color="auto" w:fill="F4F8FD"/>
+            <w:tcMar>
+              <w:top w:w="100" w:type="dxa"/>
+              <w:bottom w:w="100" w:type="dxa"/>
+              <w:start w:w="140" w:type="dxa"/>
+              <w:end w:w="140" w:type="dxa"/>
+              <w:left w:w="140" w:type="dxa"/>
+              <w:right w:w="140" w:type="dxa"/>
+            </w:tcMar>
+          </w:tcPr>
+          <w:p>
+            <w:r/>
+            <w:r>
+              <w:rPr>
+                <w:rFonts w:ascii="Lato" w:hAnsi="Lato" w:cs="Lato"/>
+                <w:b w:val="0"/>
+                <w:i w:val="0"/>
+                <w:color w:val="46566B"/>
+                <w:sz w:val="19"/>
+              </w:rPr>
+              <w:t>Hoy el negocio depende de ti</w:t>
+            </w:r>
+          </w:p>
+        </w:tc>
+      </w:tr>
+      <w:tr>
+        <w:tc>
+          <w:tcPr>
+            <w:tcW w:type="dxa" w:w="2194"/>
+            <w:shd w:val="clear" w:color="auto" w:fill="FFFFFF"/>
+            <w:tcMar>
+              <w:top w:w="100" w:type="dxa"/>
+              <w:bottom w:w="100" w:type="dxa"/>
+              <w:start w:w="140" w:type="dxa"/>
+              <w:end w:w="140" w:type="dxa"/>
+              <w:left w:w="140" w:type="dxa"/>
+              <w:right w:w="140" w:type="dxa"/>
+            </w:tcMar>
+          </w:tcPr>
+          <w:p>
+            <w:r/>
+            <w:r>
+              <w:rPr>
+                <w:rFonts w:ascii="Lato" w:hAnsi="Lato" w:cs="Lato"/>
+                <w:b/>
+                <w:i w:val="0"/>
+                <w:color w:val="0E1B2C"/>
+                <w:sz w:val="19"/>
+              </w:rPr>
+              <w:t>Pedidos por mes</w:t>
+            </w:r>
+          </w:p>
+        </w:tc>
+        <w:tc>
+          <w:tcPr>
+            <w:tcW w:type="dxa" w:w="2992"/>
+            <w:shd w:val="clear" w:color="auto" w:fill="FFFFFF"/>
+            <w:tcMar>
+              <w:top w:w="100" w:type="dxa"/>
+              <w:bottom w:w="100" w:type="dxa"/>
+              <w:start w:w="140" w:type="dxa"/>
+              <w:end w:w="140" w:type="dxa"/>
+              <w:left w:w="140" w:type="dxa"/>
+              <w:right w:w="140" w:type="dxa"/>
+            </w:tcMar>
+          </w:tcPr>
+          <w:p>
+            <w:r/>
+            <w:r>
+              <w:rPr>
+                <w:rFonts w:ascii="Lato" w:hAnsi="Lato" w:cs="Lato"/>
+                <w:b w:val="0"/>
+                <w:i w:val="0"/>
+                <w:color w:val="46566B"/>
+                <w:sz w:val="19"/>
+              </w:rPr>
+              <w:t>de ~8 (bajo) a 60 (alto)</w:t>
+            </w:r>
+          </w:p>
+        </w:tc>
+        <w:tc>
+          <w:tcPr>
+            <w:tcW w:type="dxa" w:w="4787"/>
+            <w:shd w:val="clear" w:color="auto" w:fill="FFFFFF"/>
+            <w:tcMar>
+              <w:top w:w="100" w:type="dxa"/>
+              <w:bottom w:w="100" w:type="dxa"/>
+              <w:start w:w="140" w:type="dxa"/>
+              <w:end w:w="140" w:type="dxa"/>
+              <w:left w:w="140" w:type="dxa"/>
+              <w:right w:w="140" w:type="dxa"/>
+            </w:tcMar>
+          </w:tcPr>
+          <w:p>
+            <w:r/>
+            <w:r>
+              <w:rPr>
+                <w:rFonts w:ascii="Lato" w:hAnsi="Lato" w:cs="Lato"/>
+                <w:b w:val="0"/>
+                <w:i w:val="0"/>
+                <w:color w:val="46566B"/>
+                <w:sz w:val="19"/>
+              </w:rPr>
+              <w:t>Mucha variación; conviene estabilizar</w:t>
+            </w:r>
+          </w:p>
+        </w:tc>
+      </w:tr>
+      <w:tr>
+        <w:tc>
+          <w:tcPr>
+            <w:tcW w:type="dxa" w:w="2194"/>
+            <w:shd w:val="clear" w:color="auto" w:fill="F4F8FD"/>
+            <w:tcMar>
+              <w:top w:w="100" w:type="dxa"/>
+              <w:bottom w:w="100" w:type="dxa"/>
+              <w:start w:w="140" w:type="dxa"/>
+              <w:end w:w="140" w:type="dxa"/>
+              <w:left w:w="140" w:type="dxa"/>
+              <w:right w:w="140" w:type="dxa"/>
+            </w:tcMar>
+          </w:tcPr>
+          <w:p>
+            <w:r/>
+            <w:r>
+              <w:rPr>
+                <w:rFonts w:ascii="Lato" w:hAnsi="Lato" w:cs="Lato"/>
+                <w:b/>
+                <w:i w:val="0"/>
+                <w:color w:val="0E1B2C"/>
+                <w:sz w:val="19"/>
+              </w:rPr>
+              <w:t>Ticket común</w:t>
+            </w:r>
+          </w:p>
+        </w:tc>
+        <w:tc>
+          <w:tcPr>
+            <w:tcW w:type="dxa" w:w="2992"/>
+            <w:shd w:val="clear" w:color="auto" w:fill="F4F8FD"/>
+            <w:tcMar>
+              <w:top w:w="100" w:type="dxa"/>
+              <w:bottom w:w="100" w:type="dxa"/>
+              <w:start w:w="140" w:type="dxa"/>
+              <w:end w:w="140" w:type="dxa"/>
+              <w:left w:w="140" w:type="dxa"/>
+              <w:right w:w="140" w:type="dxa"/>
+            </w:tcMar>
+          </w:tcPr>
+          <w:p>
+            <w:r/>
+            <w:r>
+              <w:rPr>
+                <w:rFonts w:ascii="Lato" w:hAnsi="Lato" w:cs="Lato"/>
+                <w:b w:val="0"/>
+                <w:i w:val="0"/>
+                <w:color w:val="46566B"/>
+                <w:sz w:val="19"/>
+              </w:rPr>
+              <w:t>~$3,000 por juego de 20</w:t>
+            </w:r>
+          </w:p>
+        </w:tc>
+        <w:tc>
+          <w:tcPr>
+            <w:tcW w:type="dxa" w:w="4787"/>
+            <w:shd w:val="clear" w:color="auto" w:fill="F4F8FD"/>
+            <w:tcMar>
+              <w:top w:w="100" w:type="dxa"/>
+              <w:bottom w:w="100" w:type="dxa"/>
+              <w:start w:w="140" w:type="dxa"/>
+              <w:end w:w="140" w:type="dxa"/>
+              <w:left w:w="140" w:type="dxa"/>
+              <w:right w:w="140" w:type="dxa"/>
+            </w:tcMar>
+          </w:tcPr>
+          <w:p>
+            <w:r/>
+            <w:r>
+              <w:rPr>
+                <w:rFonts w:ascii="Lato" w:hAnsi="Lato" w:cs="Lato"/>
+                <w:b w:val="0"/>
+                <w:i w:val="0"/>
+                <w:color w:val="46566B"/>
+                <w:sz w:val="19"/>
+              </w:rPr>
+              <w:t>Márgenes sanos, con espacio para volumen</w:t>
+            </w:r>
+          </w:p>
+        </w:tc>
+      </w:tr>
+      <w:tr>
+        <w:tc>
+          <w:tcPr>
+            <w:tcW w:type="dxa" w:w="2194"/>
+            <w:shd w:val="clear" w:color="auto" w:fill="FFFFFF"/>
+            <w:tcMar>
+              <w:top w:w="100" w:type="dxa"/>
+              <w:bottom w:w="100" w:type="dxa"/>
+              <w:start w:w="140" w:type="dxa"/>
+              <w:end w:w="140" w:type="dxa"/>
+              <w:left w:w="140" w:type="dxa"/>
+              <w:right w:w="140" w:type="dxa"/>
+            </w:tcMar>
+          </w:tcPr>
+          <w:p>
+            <w:r/>
+            <w:r>
+              <w:rPr>
+                <w:rFonts w:ascii="Lato" w:hAnsi="Lato" w:cs="Lato"/>
+                <w:b/>
+                <w:i w:val="0"/>
+                <w:color w:val="0E1B2C"/>
+                <w:sz w:val="19"/>
+              </w:rPr>
+              <w:t>Recompra</w:t>
+            </w:r>
+          </w:p>
+        </w:tc>
+        <w:tc>
+          <w:tcPr>
+            <w:tcW w:type="dxa" w:w="2992"/>
+            <w:shd w:val="clear" w:color="auto" w:fill="FFFFFF"/>
+            <w:tcMar>
+              <w:top w:w="100" w:type="dxa"/>
+              <w:bottom w:w="100" w:type="dxa"/>
+              <w:start w:w="140" w:type="dxa"/>
+              <w:end w:w="140" w:type="dxa"/>
+              <w:left w:w="140" w:type="dxa"/>
+              <w:right w:w="140" w:type="dxa"/>
+            </w:tcMar>
+          </w:tcPr>
+          <w:p>
+            <w:r/>
+            <w:r>
+              <w:rPr>
+                <w:rFonts w:ascii="Lato" w:hAnsi="Lato" w:cs="Lato"/>
+                <w:b w:val="0"/>
+                <w:i w:val="0"/>
+                <w:color w:val="46566B"/>
+                <w:sz w:val="19"/>
+              </w:rPr>
+              <w:t>pines ~15 días · sellos ~30–45 días</w:t>
+            </w:r>
+          </w:p>
+        </w:tc>
+        <w:tc>
+          <w:tcPr>
+            <w:tcW w:type="dxa" w:w="4787"/>
+            <w:shd w:val="clear" w:color="auto" w:fill="FFFFFF"/>
+            <w:tcMar>
+              <w:top w:w="100" w:type="dxa"/>
+              <w:bottom w:w="100" w:type="dxa"/>
+              <w:start w:w="140" w:type="dxa"/>
+              <w:end w:w="140" w:type="dxa"/>
+              <w:left w:w="140" w:type="dxa"/>
+              <w:right w:w="140" w:type="dxa"/>
+            </w:tcMar>
+          </w:tcPr>
+          <w:p>
+            <w:r/>
+            <w:r>
+              <w:rPr>
+                <w:rFonts w:ascii="Lato" w:hAnsi="Lato" w:cs="Lato"/>
+                <w:b w:val="0"/>
+                <w:i w:val="0"/>
+                <w:color w:val="46566B"/>
+                <w:sz w:val="19"/>
+              </w:rPr>
+              <w:t>Clientes que regresan, hoy sin seguimiento</w:t>
+            </w:r>
+          </w:p>
+        </w:tc>
+      </w:tr>
+      <w:tr>
+        <w:tc>
+          <w:tcPr>
+            <w:tcW w:type="dxa" w:w="2194"/>
+            <w:shd w:val="clear" w:color="auto" w:fill="F4F8FD"/>
+            <w:tcMar>
+              <w:top w:w="100" w:type="dxa"/>
+              <w:bottom w:w="100" w:type="dxa"/>
+              <w:start w:w="140" w:type="dxa"/>
+              <w:end w:w="140" w:type="dxa"/>
+              <w:left w:w="140" w:type="dxa"/>
+              <w:right w:w="140" w:type="dxa"/>
+            </w:tcMar>
+          </w:tcPr>
+          <w:p>
+            <w:r/>
+            <w:r>
+              <w:rPr>
+                <w:rFonts w:ascii="Lato" w:hAnsi="Lato" w:cs="Lato"/>
+                <w:b/>
+                <w:i w:val="0"/>
+                <w:color w:val="0E1B2C"/>
+                <w:sz w:val="19"/>
+              </w:rPr>
+              <w:t>Mercado</w:t>
+            </w:r>
+          </w:p>
+        </w:tc>
+        <w:tc>
+          <w:tcPr>
+            <w:tcW w:type="dxa" w:w="2992"/>
+            <w:shd w:val="clear" w:color="auto" w:fill="F4F8FD"/>
+            <w:tcMar>
+              <w:top w:w="100" w:type="dxa"/>
+              <w:bottom w:w="100" w:type="dxa"/>
+              <w:start w:w="140" w:type="dxa"/>
+              <w:end w:w="140" w:type="dxa"/>
+              <w:left w:w="140" w:type="dxa"/>
+              <w:right w:w="140" w:type="dxa"/>
+            </w:tcMar>
+          </w:tcPr>
+          <w:p>
+            <w:r/>
+            <w:r>
+              <w:rPr>
+                <w:rFonts w:ascii="Lato" w:hAnsi="Lato" w:cs="Lato"/>
+                <w:b w:val="0"/>
+                <w:i w:val="0"/>
+                <w:color w:val="46566B"/>
+                <w:sz w:val="19"/>
+              </w:rPr>
+              <w:t>~80% México / ~20% EE.UU.</w:t>
+            </w:r>
+          </w:p>
+        </w:tc>
+        <w:tc>
+          <w:tcPr>
+            <w:tcW w:type="dxa" w:w="4787"/>
+            <w:shd w:val="clear" w:color="auto" w:fill="F4F8FD"/>
+            <w:tcMar>
+              <w:top w:w="100" w:type="dxa"/>
+              <w:bottom w:w="100" w:type="dxa"/>
+              <w:start w:w="140" w:type="dxa"/>
+              <w:end w:w="140" w:type="dxa"/>
+              <w:left w:w="140" w:type="dxa"/>
+              <w:right w:w="140" w:type="dxa"/>
+            </w:tcMar>
+          </w:tcPr>
+          <w:p>
+            <w:r/>
+            <w:r>
+              <w:rPr>
+                <w:rFonts w:ascii="Lato" w:hAnsi="Lato" w:cs="Lato"/>
+                <w:b w:val="0"/>
+                <w:i w:val="0"/>
+                <w:color w:val="46566B"/>
+                <w:sz w:val="19"/>
+              </w:rPr>
+              <w:t>El mercado latino de EE.UU. ya te compra</w:t>
+            </w:r>
+          </w:p>
+        </w:tc>
+      </w:tr>
+    </w:tbl>
+    <w:p>
+      <w:pPr>
+        <w:spacing w:after="40" w:before="0" w:line="276" w:lineRule="auto"/>
+      </w:pPr>
+    </w:p>
+    <w:tbl>
+      <w:tblPr>
+        <w:tblW w:type="auto" w:w="0"/>
+        <w:tblLook w:firstColumn="1" w:firstRow="1" w:lastColumn="0" w:lastRow="0" w:noHBand="0" w:noVBand="1" w:val="04A0"/>
+      </w:tblPr>
+      <w:tblGrid>
+        <w:gridCol w:w="9972"/>
+      </w:tblGrid>
+      <w:tr>
+        <w:tc>
+          <w:tcPr>
+            <w:tcW w:type="dxa" w:w="9972"/>
+            <w:shd w:val="clear" w:color="auto" w:fill="F4F8FD"/>
+            <w:tcMar>
+              <w:top w:w="160" w:type="dxa"/>
+              <w:bottom w:w="160" w:type="dxa"/>
+              <w:start w:w="220" w:type="dxa"/>
+              <w:end w:w="220" w:type="dxa"/>
+              <w:left w:w="220" w:type="dxa"/>
+              <w:right w:w="220" w:type="dxa"/>
+            </w:tcMar>
+            <w:tcBorders>
+              <w:top w:val="single" w:sz="20" w:space="0" w:color="0A74DA"/>
+            </w:tcBorders>
+          </w:tcPr>
+          <w:p>
+            <w:r/>
+            <w:r>
+              <w:rPr>
+                <w:rFonts w:ascii="Lato" w:hAnsi="Lato" w:cs="Lato"/>
+                <w:b/>
+                <w:i w:val="0"/>
+                <w:color w:val="0E1B2C"/>
+                <w:sz w:val="21"/>
+              </w:rPr>
+              <w:t xml:space="preserve">La foto real.  </w:t>
+            </w:r>
+            <w:r>
+              <w:rPr>
+                <w:rFonts w:ascii="Lato" w:hAnsi="Lato" w:cs="Lato"/>
+                <w:b w:val="0"/>
+                <w:i w:val="0"/>
+                <w:color w:val="46566B"/>
+                <w:sz w:val="21"/>
+              </w:rPr>
+              <w:t>Metales Infinity es un negocio rentable que hoy descansa por completo en ti: eres el único motor de ventas, atención y logística. El objetivo es darle un sistema que venda, cobre y dé seguimiento, para que no todo pase por tus manos.</w:t>
+            </w:r>
+          </w:p>
+        </w:tc>
+      </w:tr>
+    </w:tbl>
+    <w:p>
+      <w:pPr>
+        <w:spacing w:after="120" w:before="120" w:line="276" w:lineRule="auto"/>
+      </w:pPr>
+      <w:r>
+        <w:rPr>
+          <w:rFonts w:ascii="Lato" w:hAnsi="Lato" w:cs="Lato"/>
+          <w:b w:val="0"/>
+          <w:i w:val="0"/>
+          <w:color w:val="46566B"/>
+          <w:sz w:val="21"/>
+        </w:rPr>
+        <w:t>En concreto, cuatro cosas te frenan hoy:</w:t>
       </w:r>
     </w:p>
     <w:p>
@@ -349,7 +1056,7 @@
           <w:color w:val="46566B"/>
           <w:sz w:val="21"/>
         </w:rPr>
-        <w:t>Muchas horas al día contestando mensajes y mandando fotos una por una; si tú no estás, la venta se detiene.</w:t>
+        <w:t>Muchas horas al día contestando y mandando fotos una por una; si faltas, la venta se detiene.</w:t>
       </w:r>
     </w:p>
     <w:p>
@@ -421,7 +1128,7 @@
           <w:color w:val="46566B"/>
           <w:sz w:val="21"/>
         </w:rPr>
-        <w:t>Fabricas primero y cobras al final: si cancelan, tú absorbes el material y el tiempo invertido.</w:t>
+        <w:t>Fabricas primero y cobras al final: si cancelan, tú absorbes material y tiempo.</w:t>
       </w:r>
     </w:p>
     <w:p>
@@ -447,7 +1154,7 @@
           <w:color w:val="0E1B2C"/>
           <w:sz w:val="21"/>
         </w:rPr>
-        <w:t xml:space="preserve">Solo Facebook y WhatsApp. </w:t>
+        <w:t xml:space="preserve">Sin tienda propia. </w:t>
       </w:r>
       <w:r>
         <w:rPr>
@@ -457,60 +1164,9 @@
           <w:color w:val="46566B"/>
           <w:sz w:val="21"/>
         </w:rPr>
-        <w:t>No tienes tienda propia; competidores como Sellare ya venden con tienda y precios visibles, y te toman ventaja en lo digital.</w:t>
+        <w:t>Competidores como Sellare ya venden con tienda y precios visibles, y te toman ventaja en lo digital. En Querétaro casi no tienes competencia directa: la ventana está abierta.</w:t>
       </w:r>
     </w:p>
-    <w:tbl>
-      <w:tblPr>
-        <w:tblW w:type="auto" w:w="0"/>
-        <w:tblLook w:firstColumn="1" w:firstRow="1" w:lastColumn="0" w:lastRow="0" w:noHBand="0" w:noVBand="1" w:val="04A0"/>
-      </w:tblPr>
-      <w:tblGrid>
-        <w:gridCol w:w="9972"/>
-      </w:tblGrid>
-      <w:tr>
-        <w:tc>
-          <w:tcPr>
-            <w:tcW w:type="dxa" w:w="9972"/>
-            <w:shd w:val="clear" w:color="auto" w:fill="F4F8FD"/>
-            <w:tcMar>
-              <w:top w:w="160" w:type="dxa"/>
-              <w:bottom w:w="160" w:type="dxa"/>
-              <w:start w:w="220" w:type="dxa"/>
-              <w:end w:w="220" w:type="dxa"/>
-              <w:left w:w="220" w:type="dxa"/>
-              <w:right w:w="220" w:type="dxa"/>
-            </w:tcMar>
-            <w:tcBorders>
-              <w:top w:val="single" w:sz="20" w:space="0" w:color="28A745"/>
-            </w:tcBorders>
-          </w:tcPr>
-          <w:p>
-            <w:r/>
-            <w:r>
-              <w:rPr>
-                <w:rFonts w:ascii="Lato" w:hAnsi="Lato" w:cs="Lato"/>
-                <w:b/>
-                <w:i w:val="0"/>
-                <w:color w:val="28A745"/>
-                <w:sz w:val="21"/>
-              </w:rPr>
-              <w:t xml:space="preserve">A tu favor.  </w:t>
-            </w:r>
-            <w:r>
-              <w:rPr>
-                <w:rFonts w:ascii="Lato" w:hAnsi="Lato" w:cs="Lato"/>
-                <w:b w:val="0"/>
-                <w:i w:val="0"/>
-                <w:color w:val="46566B"/>
-                <w:sz w:val="21"/>
-              </w:rPr>
-              <w:t>En Querétaro casi no tienes competencia directa en tu nicho, y ya vendes a Estados Unidos. Una tienda bilingüe te posiciona antes que los competidores, que siguen vendiendo solo por chat.</w:t>
-            </w:r>
-          </w:p>
-        </w:tc>
-      </w:tr>
-    </w:tbl>
     <w:tbl>
       <w:tblPr>
         <w:tblW w:type="auto" w:w="0"/>
@@ -556,7 +1212,7 @@
                 <w:color w:val="46566B"/>
                 <w:sz w:val="21"/>
               </w:rPr>
-              <w:t>Darte de alta en el SAT no es necesario para arrancar tu tienda en México ni para tener el sitio en inglés. Solo se vuelve útil más adelante si quieres facturar formalmente o cobrar y retirar en dólares. Lo dejamos como referencia, no como presión.</w:t>
+              <w:t>Darte de alta en el SAT no es necesario para arrancar tu tienda en México ni para tener el sitio en inglés. Solo se vuelve útil más adelante si quieres facturar formalmente o cobrar y retirar en dólares. Lo dejamos como referencia, tú decides cuándo.</w:t>
             </w:r>
           </w:p>
         </w:tc>
@@ -565,7 +1221,7 @@
     <w:p>
       <w:pPr>
         <w:keepNext/>
-        <w:spacing w:before="320" w:after="160"/>
+        <w:spacing w:before="300" w:after="140"/>
         <w:pBdr>
           <w:bottom w:val="single" w:sz="10" w:space="4" w:color="E3EBF4"/>
         </w:pBdr>
@@ -576,7 +1232,7 @@
           <w:b/>
           <w:i w:val="0"/>
           <w:color w:val="00C2FF"/>
-          <w:sz w:val="28"/>
+          <w:sz w:val="27"/>
         </w:rPr>
         <w:t xml:space="preserve">3  </w:t>
       </w:r>
@@ -586,7 +1242,7 @@
           <w:b/>
           <w:i w:val="0"/>
           <w:color w:val="0A74DA"/>
-          <w:sz w:val="28"/>
+          <w:sz w:val="27"/>
         </w:rPr>
         <w:t>La propuesta: tu propia tienda en línea</w:t>
       </w:r>
@@ -603,7 +1259,7 @@
           <w:color w:val="46566B"/>
           <w:sz w:val="21"/>
         </w:rPr>
-        <w:t>Te proponemos una tienda propia (no rentada): el sitio es tuyo, en tu dominio, con el código respaldado en GitHub y alojado en Cloudflare. Bilingüe desde el inicio, con precios visibles, catálogo, pedidos personalizados, reseñas de clientes y botón de WhatsApp. Para arrancar, dos caminos:</w:t>
+        <w:t>Una tienda propia (no rentada): el sitio es tuyo, en tu dominio, con el código respaldado y alojado en la nube. Bilingüe desde el inicio, con precios visibles, catálogo, pedidos personalizados, reseñas de clientes y botón de WhatsApp. Para arrancar, dos caminos:</w:t>
       </w:r>
     </w:p>
     <w:tbl>
@@ -726,7 +1382,7 @@
                 <w:color w:val="46566B"/>
                 <w:sz w:val="20"/>
               </w:rPr>
-              <w:t>rápida y económica; conservas tu trato personal; ideal para personalizados.</w:t>
+              <w:t>rápida y económica; conservas tu trato personal.</w:t>
             </w:r>
           </w:p>
           <w:p>
@@ -751,7 +1407,7 @@
                 <w:color w:val="46566B"/>
                 <w:sz w:val="20"/>
               </w:rPr>
-              <w:t>no cobra en línea (el pago sigue como hoy); no es autoservicio completo.</w:t>
+              <w:t>no cobra en línea; no es autoservicio completo.</w:t>
             </w:r>
           </w:p>
         </w:tc>
@@ -861,7 +1517,7 @@
                 <w:color w:val="46566B"/>
                 <w:sz w:val="20"/>
               </w:rPr>
-              <w:t>vende sola 24/7, cobra anticipo, ordena pedidos y saldos, y queda lista para EE.UU.</w:t>
+              <w:t>vende 24/7, cobra anticipo, ordena pedidos y saldos, lista para EE.UU.</w:t>
             </w:r>
           </w:p>
           <w:p>
@@ -951,7 +1607,7 @@
     <w:p>
       <w:pPr>
         <w:keepNext/>
-        <w:spacing w:before="320" w:after="160"/>
+        <w:spacing w:before="300" w:after="140"/>
         <w:pBdr>
           <w:bottom w:val="single" w:sz="10" w:space="4" w:color="E3EBF4"/>
         </w:pBdr>
@@ -962,7 +1618,7 @@
           <w:b/>
           <w:i w:val="0"/>
           <w:color w:val="00C2FF"/>
-          <w:sz w:val="28"/>
+          <w:sz w:val="27"/>
         </w:rPr>
         <w:t xml:space="preserve">4  </w:t>
       </w:r>
@@ -972,9 +1628,415 @@
           <w:b/>
           <w:i w:val="0"/>
           <w:color w:val="0A74DA"/>
-          <w:sz w:val="28"/>
+          <w:sz w:val="27"/>
         </w:rPr>
-        <w:t>Plan de trabajo (por etapas, no por fechas prometidas)</w:t>
+        <w:t>Punto de partida: tu Kit de Marca</w:t>
+      </w:r>
+    </w:p>
+    <w:p>
+      <w:pPr>
+        <w:spacing w:after="120" w:before="0" w:line="276" w:lineRule="auto"/>
+      </w:pPr>
+      <w:r>
+        <w:rPr>
+          <w:rFonts w:ascii="Lato" w:hAnsi="Lato" w:cs="Lato"/>
+          <w:b w:val="0"/>
+          <w:i w:val="0"/>
+          <w:color w:val="46566B"/>
+          <w:sz w:val="21"/>
+        </w:rPr>
+        <w:t>Una tienda profesional necesita una marca lista para web. Vimos que ya tienes un logotipo y una marca de agua en tus fotos; el primer paso es confirmar si existen en el formato y los tamaños que un sitio requiere. Si no, empezamos por ahí (Etapa 0).</w:t>
+      </w:r>
+    </w:p>
+    <w:p>
+      <w:pPr>
+        <w:spacing w:after="100" w:line="269" w:lineRule="auto"/>
+        <w:ind w:left="227"/>
+      </w:pPr>
+      <w:r>
+        <w:rPr>
+          <w:rFonts w:ascii="Lato" w:hAnsi="Lato" w:cs="Lato"/>
+          <w:b/>
+          <w:i w:val="0"/>
+          <w:color w:val="0A74DA"/>
+          <w:sz w:val="21"/>
+        </w:rPr>
+        <w:t xml:space="preserve">● </w:t>
+      </w:r>
+      <w:r>
+        <w:rPr>
+          <w:rFonts w:ascii="Lato" w:hAnsi="Lato" w:cs="Lato"/>
+          <w:b/>
+          <w:i w:val="0"/>
+          <w:color w:val="0E1B2C"/>
+          <w:sz w:val="21"/>
+        </w:rPr>
+        <w:t xml:space="preserve">Logotipo en varios formatos y tamaños: </w:t>
+      </w:r>
+      <w:r>
+        <w:rPr>
+          <w:rFonts w:ascii="Lato" w:hAnsi="Lato" w:cs="Lato"/>
+          <w:b w:val="0"/>
+          <w:i w:val="0"/>
+          <w:color w:val="46566B"/>
+          <w:sz w:val="21"/>
+        </w:rPr>
+        <w:t>versión horizontal, ícono/avatar, marca de agua y favicon; idealmente en vector (SVG/PDF) para que se vea nítido en cualquier medida.</w:t>
+      </w:r>
+    </w:p>
+    <w:p>
+      <w:pPr>
+        <w:spacing w:after="100" w:line="269" w:lineRule="auto"/>
+        <w:ind w:left="227"/>
+      </w:pPr>
+      <w:r>
+        <w:rPr>
+          <w:rFonts w:ascii="Lato" w:hAnsi="Lato" w:cs="Lato"/>
+          <w:b/>
+          <w:i w:val="0"/>
+          <w:color w:val="0A74DA"/>
+          <w:sz w:val="21"/>
+        </w:rPr>
+        <w:t xml:space="preserve">● </w:t>
+      </w:r>
+      <w:r>
+        <w:rPr>
+          <w:rFonts w:ascii="Lato" w:hAnsi="Lato" w:cs="Lato"/>
+          <w:b/>
+          <w:i w:val="0"/>
+          <w:color w:val="0E1B2C"/>
+          <w:sz w:val="21"/>
+        </w:rPr>
+        <w:t xml:space="preserve">Identidad visual: </w:t>
+      </w:r>
+      <w:r>
+        <w:rPr>
+          <w:rFonts w:ascii="Lato" w:hAnsi="Lato" w:cs="Lato"/>
+          <w:b w:val="0"/>
+          <w:i w:val="0"/>
+          <w:color w:val="46566B"/>
+          <w:sz w:val="21"/>
+        </w:rPr>
+        <w:t>paleta de colores oficial, tipografías y estilo de fotografía, para que todo se vea consistente.</w:t>
+      </w:r>
+    </w:p>
+    <w:p>
+      <w:pPr>
+        <w:spacing w:after="100" w:line="269" w:lineRule="auto"/>
+        <w:ind w:left="227"/>
+      </w:pPr>
+      <w:r>
+        <w:rPr>
+          <w:rFonts w:ascii="Lato" w:hAnsi="Lato" w:cs="Lato"/>
+          <w:b/>
+          <w:i w:val="0"/>
+          <w:color w:val="0A74DA"/>
+          <w:sz w:val="21"/>
+        </w:rPr>
+        <w:t xml:space="preserve">● </w:t>
+      </w:r>
+      <w:r>
+        <w:rPr>
+          <w:rFonts w:ascii="Lato" w:hAnsi="Lato" w:cs="Lato"/>
+          <w:b/>
+          <w:i w:val="0"/>
+          <w:color w:val="0E1B2C"/>
+          <w:sz w:val="21"/>
+        </w:rPr>
+        <w:t xml:space="preserve">Guía breve de marca: </w:t>
+      </w:r>
+      <w:r>
+        <w:rPr>
+          <w:rFonts w:ascii="Lato" w:hAnsi="Lato" w:cs="Lato"/>
+          <w:b w:val="0"/>
+          <w:i w:val="0"/>
+          <w:color w:val="46566B"/>
+          <w:sz w:val="21"/>
+        </w:rPr>
+        <w:t>cómo y dónde usar el logo, colores y mensajes clave (tu “calidad, precisión y esencia vaquera”).</w:t>
+      </w:r>
+    </w:p>
+    <w:tbl>
+      <w:tblPr>
+        <w:tblW w:type="auto" w:w="0"/>
+        <w:tblLook w:firstColumn="1" w:firstRow="1" w:lastColumn="0" w:lastRow="0" w:noHBand="0" w:noVBand="1" w:val="04A0"/>
+      </w:tblPr>
+      <w:tblGrid>
+        <w:gridCol w:w="9972"/>
+      </w:tblGrid>
+      <w:tr>
+        <w:tc>
+          <w:tcPr>
+            <w:tcW w:type="dxa" w:w="9972"/>
+            <w:shd w:val="clear" w:color="auto" w:fill="F4F8FD"/>
+            <w:tcMar>
+              <w:top w:w="160" w:type="dxa"/>
+              <w:bottom w:w="160" w:type="dxa"/>
+              <w:start w:w="220" w:type="dxa"/>
+              <w:end w:w="220" w:type="dxa"/>
+              <w:left w:w="220" w:type="dxa"/>
+              <w:right w:w="220" w:type="dxa"/>
+            </w:tcMar>
+            <w:tcBorders>
+              <w:top w:val="single" w:sz="20" w:space="0" w:color="28A745"/>
+            </w:tcBorders>
+          </w:tcPr>
+          <w:p>
+            <w:r/>
+            <w:r>
+              <w:rPr>
+                <w:rFonts w:ascii="Lato" w:hAnsi="Lato" w:cs="Lato"/>
+                <w:b/>
+                <w:i w:val="0"/>
+                <w:color w:val="0E1B2C"/>
+                <w:sz w:val="21"/>
+              </w:rPr>
+              <w:t xml:space="preserve">Si aún no tienes todo esto,  </w:t>
+            </w:r>
+            <w:r>
+              <w:rPr>
+                <w:rFonts w:ascii="Lato" w:hAnsi="Lato" w:cs="Lato"/>
+                <w:b w:val="0"/>
+                <w:i w:val="0"/>
+                <w:color w:val="46566B"/>
+                <w:sz w:val="21"/>
+              </w:rPr>
+              <w:t>no hay problema: lo armamos como Etapa 0 antes de construir el sitio, para no rehacer trabajo después.</w:t>
+            </w:r>
+          </w:p>
+        </w:tc>
+      </w:tr>
+    </w:tbl>
+    <w:p>
+      <w:pPr>
+        <w:keepNext/>
+        <w:spacing w:before="300" w:after="140"/>
+        <w:pBdr>
+          <w:bottom w:val="single" w:sz="10" w:space="4" w:color="E3EBF4"/>
+        </w:pBdr>
+      </w:pPr>
+      <w:r>
+        <w:rPr>
+          <w:rFonts w:ascii="Montserrat" w:hAnsi="Montserrat" w:cs="Montserrat"/>
+          <w:b/>
+          <w:i w:val="0"/>
+          <w:color w:val="00C2FF"/>
+          <w:sz w:val="27"/>
+        </w:rPr>
+        <w:t xml:space="preserve">5  </w:t>
+      </w:r>
+      <w:r>
+        <w:rPr>
+          <w:rFonts w:ascii="Montserrat" w:hAnsi="Montserrat" w:cs="Montserrat"/>
+          <w:b/>
+          <w:i w:val="0"/>
+          <w:color w:val="0A74DA"/>
+          <w:sz w:val="27"/>
+        </w:rPr>
+        <w:t>Tus redes: una sola voz de marca</w:t>
+      </w:r>
+    </w:p>
+    <w:p>
+      <w:pPr>
+        <w:spacing w:after="120" w:before="0" w:line="276" w:lineRule="auto"/>
+      </w:pPr>
+      <w:r>
+        <w:rPr>
+          <w:rFonts w:ascii="Lato" w:hAnsi="Lato" w:cs="Lato"/>
+          <w:b w:val="0"/>
+          <w:i w:val="0"/>
+          <w:color w:val="46566B"/>
+          <w:sz w:val="21"/>
+        </w:rPr>
+        <w:t>Hoy tu fuerte es Facebook. Antes y durante el lanzamiento conviene revisar y unificar todas tus presencias para que el cliente reconozca la misma marca en todos lados y todas lleven a tu tienda:</w:t>
+      </w:r>
+    </w:p>
+    <w:p>
+      <w:pPr>
+        <w:spacing w:after="100" w:line="269" w:lineRule="auto"/>
+        <w:ind w:left="227"/>
+      </w:pPr>
+      <w:r>
+        <w:rPr>
+          <w:rFonts w:ascii="Lato" w:hAnsi="Lato" w:cs="Lato"/>
+          <w:b/>
+          <w:i w:val="0"/>
+          <w:color w:val="0A74DA"/>
+          <w:sz w:val="21"/>
+        </w:rPr>
+        <w:t xml:space="preserve">● </w:t>
+      </w:r>
+      <w:r>
+        <w:rPr>
+          <w:rFonts w:ascii="Lato" w:hAnsi="Lato" w:cs="Lato"/>
+          <w:b/>
+          <w:i w:val="0"/>
+          <w:color w:val="0E1B2C"/>
+          <w:sz w:val="21"/>
+        </w:rPr>
+        <w:t xml:space="preserve">Auditoría: </w:t>
+      </w:r>
+      <w:r>
+        <w:rPr>
+          <w:rFonts w:ascii="Lato" w:hAnsi="Lato" w:cs="Lato"/>
+          <w:b w:val="0"/>
+          <w:i w:val="0"/>
+          <w:color w:val="46566B"/>
+          <w:sz w:val="21"/>
+        </w:rPr>
+        <w:t>confirmar qué tienes activo (Facebook, Instagram, TikTok, Google/Maps) y qué falta abrir.</w:t>
+      </w:r>
+    </w:p>
+    <w:p>
+      <w:pPr>
+        <w:spacing w:after="100" w:line="269" w:lineRule="auto"/>
+        <w:ind w:left="227"/>
+      </w:pPr>
+      <w:r>
+        <w:rPr>
+          <w:rFonts w:ascii="Lato" w:hAnsi="Lato" w:cs="Lato"/>
+          <w:b/>
+          <w:i w:val="0"/>
+          <w:color w:val="0A74DA"/>
+          <w:sz w:val="21"/>
+        </w:rPr>
+        <w:t xml:space="preserve">● </w:t>
+      </w:r>
+      <w:r>
+        <w:rPr>
+          <w:rFonts w:ascii="Lato" w:hAnsi="Lato" w:cs="Lato"/>
+          <w:b/>
+          <w:i w:val="0"/>
+          <w:color w:val="0E1B2C"/>
+          <w:sz w:val="21"/>
+        </w:rPr>
+        <w:t xml:space="preserve">Homogenizar perfiles: </w:t>
+      </w:r>
+      <w:r>
+        <w:rPr>
+          <w:rFonts w:ascii="Lato" w:hAnsi="Lato" w:cs="Lato"/>
+          <w:b w:val="0"/>
+          <w:i w:val="0"/>
+          <w:color w:val="46566B"/>
+          <w:sz w:val="21"/>
+        </w:rPr>
+        <w:t>mismo nombre, foto, portada, biografía y enlaces en todas las redes, apuntando a la tienda.</w:t>
+      </w:r>
+    </w:p>
+    <w:p>
+      <w:pPr>
+        <w:spacing w:after="100" w:line="269" w:lineRule="auto"/>
+        <w:ind w:left="227"/>
+      </w:pPr>
+      <w:r>
+        <w:rPr>
+          <w:rFonts w:ascii="Lato" w:hAnsi="Lato" w:cs="Lato"/>
+          <w:b/>
+          <w:i w:val="0"/>
+          <w:color w:val="0A74DA"/>
+          <w:sz w:val="21"/>
+        </w:rPr>
+        <w:t xml:space="preserve">● </w:t>
+      </w:r>
+      <w:r>
+        <w:rPr>
+          <w:rFonts w:ascii="Lato" w:hAnsi="Lato" w:cs="Lato"/>
+          <w:b/>
+          <w:i w:val="0"/>
+          <w:color w:val="0E1B2C"/>
+          <w:sz w:val="21"/>
+        </w:rPr>
+        <w:t xml:space="preserve">Google (opinión de clientes): </w:t>
+      </w:r>
+      <w:r>
+        <w:rPr>
+          <w:rFonts w:ascii="Lato" w:hAnsi="Lato" w:cs="Lato"/>
+          <w:b w:val="0"/>
+          <w:i w:val="0"/>
+          <w:color w:val="46566B"/>
+          <w:sz w:val="21"/>
+        </w:rPr>
+        <w:t>hoy tienes pocas reseñas; montamos un proceso simple para pedir opiniones reales con foto.</w:t>
+      </w:r>
+    </w:p>
+    <w:p>
+      <w:pPr>
+        <w:spacing w:after="100" w:line="269" w:lineRule="auto"/>
+        <w:ind w:left="227"/>
+      </w:pPr>
+      <w:r>
+        <w:rPr>
+          <w:rFonts w:ascii="Lato" w:hAnsi="Lato" w:cs="Lato"/>
+          <w:b/>
+          <w:i w:val="0"/>
+          <w:color w:val="0A74DA"/>
+          <w:sz w:val="21"/>
+        </w:rPr>
+        <w:t xml:space="preserve">● </w:t>
+      </w:r>
+      <w:r>
+        <w:rPr>
+          <w:rFonts w:ascii="Lato" w:hAnsi="Lato" w:cs="Lato"/>
+          <w:b/>
+          <w:i w:val="0"/>
+          <w:color w:val="0E1B2C"/>
+          <w:sz w:val="21"/>
+        </w:rPr>
+        <w:t xml:space="preserve">Contenido: </w:t>
+      </w:r>
+      <w:r>
+        <w:rPr>
+          <w:rFonts w:ascii="Lato" w:hAnsi="Lato" w:cs="Lato"/>
+          <w:b w:val="0"/>
+          <w:i w:val="0"/>
+          <w:color w:val="46566B"/>
+          <w:sz w:val="21"/>
+        </w:rPr>
+        <w:t>aprovechar el proceso de fabricación (metal, corte, resultado en la tejana) que funciona muy bien en Reels/TikTok.</w:t>
+      </w:r>
+    </w:p>
+    <w:p>
+      <w:pPr>
+        <w:keepNext/>
+        <w:spacing w:before="300" w:after="140"/>
+        <w:pBdr>
+          <w:bottom w:val="single" w:sz="10" w:space="4" w:color="E3EBF4"/>
+        </w:pBdr>
+      </w:pPr>
+      <w:r>
+        <w:rPr>
+          <w:rFonts w:ascii="Montserrat" w:hAnsi="Montserrat" w:cs="Montserrat"/>
+          <w:b/>
+          <w:i w:val="0"/>
+          <w:color w:val="00C2FF"/>
+          <w:sz w:val="27"/>
+        </w:rPr>
+        <w:t xml:space="preserve">6  </w:t>
+      </w:r>
+      <w:r>
+        <w:rPr>
+          <w:rFonts w:ascii="Montserrat" w:hAnsi="Montserrat" w:cs="Montserrat"/>
+          <w:b/>
+          <w:i w:val="0"/>
+          <w:color w:val="0A74DA"/>
+          <w:sz w:val="27"/>
+        </w:rPr>
+        <w:t>Plan de trabajo y calendario</w:t>
+      </w:r>
+    </w:p>
+    <w:p>
+      <w:pPr>
+        <w:spacing w:after="160" w:before="0" w:line="276" w:lineRule="auto"/>
+      </w:pPr>
+      <w:r>
+        <w:rPr>
+          <w:rFonts w:ascii="Lato" w:hAnsi="Lato" w:cs="Lato"/>
+          <w:b w:val="0"/>
+          <w:i w:val="0"/>
+          <w:color w:val="46566B"/>
+          <w:sz w:val="21"/>
+        </w:rPr>
+        <w:t>Trabajamos por etapas con una duración estimada. Las semanas se cuentan desde la fecha de arranque; al fijarla, cada etapa toma sus fechas exactas.</w:t>
       </w:r>
     </w:p>
     <w:tbl>
@@ -992,13 +2054,15 @@
         </w:tblBorders>
       </w:tblPr>
       <w:tblGrid>
-        <w:gridCol w:w="4986"/>
-        <w:gridCol w:w="4986"/>
+        <w:gridCol w:w="2493"/>
+        <w:gridCol w:w="2493"/>
+        <w:gridCol w:w="2493"/>
+        <w:gridCol w:w="2493"/>
       </w:tblGrid>
       <w:tr>
         <w:tc>
           <w:tcPr>
-            <w:tcW w:type="dxa" w:w="3191"/>
+            <w:tcW w:type="dxa" w:w="1296"/>
             <w:shd w:val="clear" w:color="auto" w:fill="0A74DA"/>
             <w:tcMar>
               <w:top w:w="100" w:type="dxa"/>
@@ -1017,7 +2081,7 @@
                 <w:b/>
                 <w:i w:val="0"/>
                 <w:color w:val="FFFFFF"/>
-                <w:sz w:val="20"/>
+                <w:sz w:val="19"/>
               </w:rPr>
               <w:t>Etapa</w:t>
             </w:r>
@@ -1025,7 +2089,7 @@
         </w:tc>
         <w:tc>
           <w:tcPr>
-            <w:tcW w:type="dxa" w:w="6781"/>
+            <w:tcW w:type="dxa" w:w="1994"/>
             <w:shd w:val="clear" w:color="auto" w:fill="0A74DA"/>
             <w:tcMar>
               <w:top w:w="100" w:type="dxa"/>
@@ -1044,9 +2108,63 @@
                 <w:b/>
                 <w:i w:val="0"/>
                 <w:color w:val="FFFFFF"/>
-                <w:sz w:val="20"/>
+                <w:sz w:val="19"/>
               </w:rPr>
-              <w:t>Qué hacemos</w:t>
+              <w:t>Enfoque</w:t>
+            </w:r>
+          </w:p>
+        </w:tc>
+        <w:tc>
+          <w:tcPr>
+            <w:tcW w:type="dxa" w:w="4487"/>
+            <w:shd w:val="clear" w:color="auto" w:fill="0A74DA"/>
+            <w:tcMar>
+              <w:top w:w="100" w:type="dxa"/>
+              <w:bottom w:w="100" w:type="dxa"/>
+              <w:start w:w="140" w:type="dxa"/>
+              <w:end w:w="140" w:type="dxa"/>
+              <w:left w:w="140" w:type="dxa"/>
+              <w:right w:w="140" w:type="dxa"/>
+            </w:tcMar>
+          </w:tcPr>
+          <w:p>
+            <w:r/>
+            <w:r>
+              <w:rPr>
+                <w:rFonts w:ascii="Montserrat" w:hAnsi="Montserrat" w:cs="Montserrat"/>
+                <w:b/>
+                <w:i w:val="0"/>
+                <w:color w:val="FFFFFF"/>
+                <w:sz w:val="19"/>
+              </w:rPr>
+              <w:t>Entregable clave</w:t>
+            </w:r>
+          </w:p>
+        </w:tc>
+        <w:tc>
+          <w:tcPr>
+            <w:tcW w:type="dxa" w:w="2194"/>
+            <w:shd w:val="clear" w:color="auto" w:fill="0A74DA"/>
+            <w:tcMar>
+              <w:top w:w="100" w:type="dxa"/>
+              <w:bottom w:w="100" w:type="dxa"/>
+              <w:start w:w="140" w:type="dxa"/>
+              <w:end w:w="140" w:type="dxa"/>
+              <w:left w:w="140" w:type="dxa"/>
+              <w:right w:w="140" w:type="dxa"/>
+            </w:tcMar>
+          </w:tcPr>
+          <w:p>
+            <w:r/>
+            <w:r>
+              <w:rPr>
+                <w:rFonts w:ascii="Montserrat" w:hAnsi="Montserrat" w:cs="Montserrat"/>
+                <w:b/>
+                <w:i w:val="0"/>
+                <w:color w:val="FFFFFF"/>
+                <w:sz w:val="19"/>
+              </w:rPr>
+              <w:t>Semanas (estim.)</w:t>
             </w:r>
           </w:p>
         </w:tc>
@@ -1054,7 +2172,7 @@
       <w:tr>
         <w:tc>
           <w:tcPr>
-            <w:tcW w:type="dxa" w:w="3191"/>
+            <w:tcW w:type="dxa" w:w="1296"/>
             <w:shd w:val="clear" w:color="auto" w:fill="FFFFFF"/>
             <w:tcMar>
               <w:top w:w="100" w:type="dxa"/>
@@ -1073,15 +2191,15 @@
                 <w:b/>
                 <w:i w:val="0"/>
                 <w:color w:val="0E1B2C"/>
-                <w:sz w:val="20"/>
+                <w:sz w:val="19"/>
               </w:rPr>
-              <w:t>Etapa 1 · Definición</w:t>
+              <w:t>Etapa 0</w:t>
             </w:r>
           </w:p>
         </w:tc>
         <w:tc>
           <w:tcPr>
-            <w:tcW w:type="dxa" w:w="6781"/>
+            <w:tcW w:type="dxa" w:w="1994"/>
             <w:shd w:val="clear" w:color="auto" w:fill="FFFFFF"/>
             <w:tcMar>
               <w:top w:w="100" w:type="dxa"/>
@@ -1100,9 +2218,63 @@
                 <w:b w:val="0"/>
                 <w:i w:val="0"/>
                 <w:color w:val="46566B"/>
-                <w:sz w:val="20"/>
+                <w:sz w:val="19"/>
               </w:rPr>
-              <w:t>Acordamos catálogo inicial, precios, reglas de personalización y anticipo, medio de pago y envíos.</w:t>
+              <w:t>Marca y bases</w:t>
+            </w:r>
+          </w:p>
+        </w:tc>
+        <w:tc>
+          <w:tcPr>
+            <w:tcW w:type="dxa" w:w="4487"/>
+            <w:shd w:val="clear" w:color="auto" w:fill="FFFFFF"/>
+            <w:tcMar>
+              <w:top w:w="100" w:type="dxa"/>
+              <w:bottom w:w="100" w:type="dxa"/>
+              <w:start w:w="140" w:type="dxa"/>
+              <w:end w:w="140" w:type="dxa"/>
+              <w:left w:w="140" w:type="dxa"/>
+              <w:right w:w="140" w:type="dxa"/>
+            </w:tcMar>
+          </w:tcPr>
+          <w:p>
+            <w:r/>
+            <w:r>
+              <w:rPr>
+                <w:rFonts w:ascii="Lato" w:hAnsi="Lato" w:cs="Lato"/>
+                <w:b w:val="0"/>
+                <w:i w:val="0"/>
+                <w:color w:val="46566B"/>
+                <w:sz w:val="19"/>
+              </w:rPr>
+              <w:t>Kit de marca listo + auditoría de redes</w:t>
+            </w:r>
+          </w:p>
+        </w:tc>
+        <w:tc>
+          <w:tcPr>
+            <w:tcW w:type="dxa" w:w="2194"/>
+            <w:shd w:val="clear" w:color="auto" w:fill="FFFFFF"/>
+            <w:tcMar>
+              <w:top w:w="100" w:type="dxa"/>
+              <w:bottom w:w="100" w:type="dxa"/>
+              <w:start w:w="140" w:type="dxa"/>
+              <w:end w:w="140" w:type="dxa"/>
+              <w:left w:w="140" w:type="dxa"/>
+              <w:right w:w="140" w:type="dxa"/>
+            </w:tcMar>
+          </w:tcPr>
+          <w:p>
+            <w:r/>
+            <w:r>
+              <w:rPr>
+                <w:rFonts w:ascii="Lato" w:hAnsi="Lato" w:cs="Lato"/>
+                <w:b w:val="0"/>
+                <w:i w:val="0"/>
+                <w:color w:val="46566B"/>
+                <w:sz w:val="19"/>
+              </w:rPr>
+              <w:t>Sem 1–2</w:t>
             </w:r>
           </w:p>
         </w:tc>
@@ -1110,7 +2282,7 @@
       <w:tr>
         <w:tc>
           <w:tcPr>
-            <w:tcW w:type="dxa" w:w="3191"/>
+            <w:tcW w:type="dxa" w:w="1296"/>
             <w:shd w:val="clear" w:color="auto" w:fill="F4F8FD"/>
             <w:tcMar>
               <w:top w:w="100" w:type="dxa"/>
@@ -1129,15 +2301,15 @@
                 <w:b/>
                 <w:i w:val="0"/>
                 <w:color w:val="0E1B2C"/>
-                <w:sz w:val="20"/>
+                <w:sz w:val="19"/>
               </w:rPr>
-              <w:t>Etapa 2 · Construcción y piloto</w:t>
+              <w:t>Etapa 1</w:t>
             </w:r>
           </w:p>
         </w:tc>
         <w:tc>
           <w:tcPr>
-            <w:tcW w:type="dxa" w:w="6781"/>
+            <w:tcW w:type="dxa" w:w="1994"/>
             <w:shd w:val="clear" w:color="auto" w:fill="F4F8FD"/>
             <w:tcMar>
               <w:top w:w="100" w:type="dxa"/>
@@ -1156,9 +2328,63 @@
                 <w:b w:val="0"/>
                 <w:i w:val="0"/>
                 <w:color w:val="46566B"/>
-                <w:sz w:val="20"/>
+                <w:sz w:val="19"/>
               </w:rPr>
-              <w:t>Tienda bilingüe funcionando; tú administras productos y probamos los dos recorridos de compra (catálogo y personalizado).</w:t>
+              <w:t>Definición</w:t>
+            </w:r>
+          </w:p>
+        </w:tc>
+        <w:tc>
+          <w:tcPr>
+            <w:tcW w:type="dxa" w:w="4487"/>
+            <w:shd w:val="clear" w:color="auto" w:fill="F4F8FD"/>
+            <w:tcMar>
+              <w:top w:w="100" w:type="dxa"/>
+              <w:bottom w:w="100" w:type="dxa"/>
+              <w:start w:w="140" w:type="dxa"/>
+              <w:end w:w="140" w:type="dxa"/>
+              <w:left w:w="140" w:type="dxa"/>
+              <w:right w:w="140" w:type="dxa"/>
+            </w:tcMar>
+          </w:tcPr>
+          <w:p>
+            <w:r/>
+            <w:r>
+              <w:rPr>
+                <w:rFonts w:ascii="Lato" w:hAnsi="Lato" w:cs="Lato"/>
+                <w:b w:val="0"/>
+                <w:i w:val="0"/>
+                <w:color w:val="46566B"/>
+                <w:sz w:val="19"/>
+              </w:rPr>
+              <w:t>Catálogo, precios, reglas de anticipo, pago y envíos acordados</w:t>
+            </w:r>
+          </w:p>
+        </w:tc>
+        <w:tc>
+          <w:tcPr>
+            <w:tcW w:type="dxa" w:w="2194"/>
+            <w:shd w:val="clear" w:color="auto" w:fill="F4F8FD"/>
+            <w:tcMar>
+              <w:top w:w="100" w:type="dxa"/>
+              <w:bottom w:w="100" w:type="dxa"/>
+              <w:start w:w="140" w:type="dxa"/>
+              <w:end w:w="140" w:type="dxa"/>
+              <w:left w:w="140" w:type="dxa"/>
+              <w:right w:w="140" w:type="dxa"/>
+            </w:tcMar>
+          </w:tcPr>
+          <w:p>
+            <w:r/>
+            <w:r>
+              <w:rPr>
+                <w:rFonts w:ascii="Lato" w:hAnsi="Lato" w:cs="Lato"/>
+                <w:b w:val="0"/>
+                <w:i w:val="0"/>
+                <w:color w:val="46566B"/>
+                <w:sz w:val="19"/>
+              </w:rPr>
+              <w:t>Sem 2–3</w:t>
             </w:r>
           </w:p>
         </w:tc>
@@ -1166,7 +2392,7 @@
       <w:tr>
         <w:tc>
           <w:tcPr>
-            <w:tcW w:type="dxa" w:w="3191"/>
+            <w:tcW w:type="dxa" w:w="1296"/>
             <w:shd w:val="clear" w:color="auto" w:fill="FFFFFF"/>
             <w:tcMar>
               <w:top w:w="100" w:type="dxa"/>
@@ -1185,15 +2411,15 @@
                 <w:b/>
                 <w:i w:val="0"/>
                 <w:color w:val="0E1B2C"/>
-                <w:sz w:val="20"/>
+                <w:sz w:val="19"/>
               </w:rPr>
-              <w:t>Etapa 3 · Operación y mejora</w:t>
+              <w:t>Etapa 2</w:t>
             </w:r>
           </w:p>
         </w:tc>
         <w:tc>
           <w:tcPr>
-            <w:tcW w:type="dxa" w:w="6781"/>
+            <w:tcW w:type="dxa" w:w="1994"/>
             <w:shd w:val="clear" w:color="auto" w:fill="FFFFFF"/>
             <w:tcMar>
               <w:top w:w="100" w:type="dxa"/>
@@ -1212,9 +2438,173 @@
                 <w:b w:val="0"/>
                 <w:i w:val="0"/>
                 <w:color w:val="46566B"/>
-                <w:sz w:val="20"/>
+                <w:sz w:val="19"/>
               </w:rPr>
-              <w:t>Medimos pedidos, tiempos de atención, anticipos y entregas; ajustamos lo que haga falta.</w:t>
+              <w:t>Construcción y piloto</w:t>
+            </w:r>
+          </w:p>
+        </w:tc>
+        <w:tc>
+          <w:tcPr>
+            <w:tcW w:type="dxa" w:w="4487"/>
+            <w:shd w:val="clear" w:color="auto" w:fill="FFFFFF"/>
+            <w:tcMar>
+              <w:top w:w="100" w:type="dxa"/>
+              <w:bottom w:w="100" w:type="dxa"/>
+              <w:start w:w="140" w:type="dxa"/>
+              <w:end w:w="140" w:type="dxa"/>
+              <w:left w:w="140" w:type="dxa"/>
+              <w:right w:w="140" w:type="dxa"/>
+            </w:tcMar>
+          </w:tcPr>
+          <w:p>
+            <w:r/>
+            <w:r>
+              <w:rPr>
+                <w:rFonts w:ascii="Lato" w:hAnsi="Lato" w:cs="Lato"/>
+                <w:b w:val="0"/>
+                <w:i w:val="0"/>
+                <w:color w:val="46566B"/>
+                <w:sz w:val="19"/>
+              </w:rPr>
+              <w:t>Tienda bilingüe funcionando; tú administras y probamos los 2 recorridos de compra</w:t>
+            </w:r>
+          </w:p>
+        </w:tc>
+        <w:tc>
+          <w:tcPr>
+            <w:tcW w:type="dxa" w:w="2194"/>
+            <w:shd w:val="clear" w:color="auto" w:fill="FFFFFF"/>
+            <w:tcMar>
+              <w:top w:w="100" w:type="dxa"/>
+              <w:bottom w:w="100" w:type="dxa"/>
+              <w:start w:w="140" w:type="dxa"/>
+              <w:end w:w="140" w:type="dxa"/>
+              <w:left w:w="140" w:type="dxa"/>
+              <w:right w:w="140" w:type="dxa"/>
+            </w:tcMar>
+          </w:tcPr>
+          <w:p>
+            <w:r/>
+            <w:r>
+              <w:rPr>
+                <w:rFonts w:ascii="Lato" w:hAnsi="Lato" w:cs="Lato"/>
+                <w:b w:val="0"/>
+                <w:i w:val="0"/>
+                <w:color w:val="46566B"/>
+                <w:sz w:val="19"/>
+              </w:rPr>
+              <w:t>Sem 3–6</w:t>
+            </w:r>
+          </w:p>
+        </w:tc>
+      </w:tr>
+      <w:tr>
+        <w:tc>
+          <w:tcPr>
+            <w:tcW w:type="dxa" w:w="1296"/>
+            <w:shd w:val="clear" w:color="auto" w:fill="F4F8FD"/>
+            <w:tcMar>
+              <w:top w:w="100" w:type="dxa"/>
+              <w:bottom w:w="100" w:type="dxa"/>
+              <w:start w:w="140" w:type="dxa"/>
+              <w:end w:w="140" w:type="dxa"/>
+              <w:left w:w="140" w:type="dxa"/>
+              <w:right w:w="140" w:type="dxa"/>
+            </w:tcMar>
+          </w:tcPr>
+          <w:p>
+            <w:r/>
+            <w:r>
+              <w:rPr>
+                <w:rFonts w:ascii="Lato" w:hAnsi="Lato" w:cs="Lato"/>
+                <w:b/>
+                <w:i w:val="0"/>
+                <w:color w:val="0E1B2C"/>
+                <w:sz w:val="19"/>
+              </w:rPr>
+              <w:t>Etapa 3</w:t>
+            </w:r>
+          </w:p>
+        </w:tc>
+        <w:tc>
+          <w:tcPr>
+            <w:tcW w:type="dxa" w:w="1994"/>
+            <w:shd w:val="clear" w:color="auto" w:fill="F4F8FD"/>
+            <w:tcMar>
+              <w:top w:w="100" w:type="dxa"/>
+              <w:bottom w:w="100" w:type="dxa"/>
+              <w:start w:w="140" w:type="dxa"/>
+              <w:end w:w="140" w:type="dxa"/>
+              <w:left w:w="140" w:type="dxa"/>
+              <w:right w:w="140" w:type="dxa"/>
+            </w:tcMar>
+          </w:tcPr>
+          <w:p>
+            <w:r/>
+            <w:r>
+              <w:rPr>
+                <w:rFonts w:ascii="Lato" w:hAnsi="Lato" w:cs="Lato"/>
+                <w:b w:val="0"/>
+                <w:i w:val="0"/>
+                <w:color w:val="46566B"/>
+                <w:sz w:val="19"/>
+              </w:rPr>
+              <w:t>Lanzamiento y mejora</w:t>
+            </w:r>
+          </w:p>
+        </w:tc>
+        <w:tc>
+          <w:tcPr>
+            <w:tcW w:type="dxa" w:w="4487"/>
+            <w:shd w:val="clear" w:color="auto" w:fill="F4F8FD"/>
+            <w:tcMar>
+              <w:top w:w="100" w:type="dxa"/>
+              <w:bottom w:w="100" w:type="dxa"/>
+              <w:start w:w="140" w:type="dxa"/>
+              <w:end w:w="140" w:type="dxa"/>
+              <w:left w:w="140" w:type="dxa"/>
+              <w:right w:w="140" w:type="dxa"/>
+            </w:tcMar>
+          </w:tcPr>
+          <w:p>
+            <w:r/>
+            <w:r>
+              <w:rPr>
+                <w:rFonts w:ascii="Lato" w:hAnsi="Lato" w:cs="Lato"/>
+                <w:b w:val="0"/>
+                <w:i w:val="0"/>
+                <w:color w:val="46566B"/>
+                <w:sz w:val="19"/>
+              </w:rPr>
+              <w:t>Sitio en vivo; medimos y ajustamos</w:t>
+            </w:r>
+          </w:p>
+        </w:tc>
+        <w:tc>
+          <w:tcPr>
+            <w:tcW w:type="dxa" w:w="2194"/>
+            <w:shd w:val="clear" w:color="auto" w:fill="F4F8FD"/>
+            <w:tcMar>
+              <w:top w:w="100" w:type="dxa"/>
+              <w:bottom w:w="100" w:type="dxa"/>
+              <w:start w:w="140" w:type="dxa"/>
+              <w:end w:w="140" w:type="dxa"/>
+              <w:left w:w="140" w:type="dxa"/>
+              <w:right w:w="140" w:type="dxa"/>
+            </w:tcMar>
+          </w:tcPr>
+          <w:p>
+            <w:r/>
+            <w:r>
+              <w:rPr>
+                <w:rFonts w:ascii="Lato" w:hAnsi="Lato" w:cs="Lato"/>
+                <w:b w:val="0"/>
+                <w:i w:val="0"/>
+                <w:color w:val="46566B"/>
+                <w:sz w:val="19"/>
+              </w:rPr>
+              <w:t>Sem 6 en adelante</w:t>
             </w:r>
           </w:p>
         </w:tc>
@@ -1224,6 +2614,31 @@
       <w:pPr>
         <w:spacing w:after="40" w:before="0" w:line="276" w:lineRule="auto"/>
       </w:pPr>
+    </w:p>
+    <w:p>
+      <w:pPr>
+        <w:spacing w:after="120" w:before="0" w:line="276" w:lineRule="auto"/>
+      </w:pPr>
+      <w:r>
+        <w:rPr>
+          <w:rFonts w:ascii="Lato" w:hAnsi="Lato" w:cs="Lato"/>
+          <w:b/>
+          <w:i w:val="0"/>
+          <w:color w:val="0E1B2C"/>
+          <w:sz w:val="20"/>
+        </w:rPr>
+        <w:t xml:space="preserve">Fecha de inicio propuesta:  </w:t>
+      </w:r>
+      <w:r>
+        <w:rPr>
+          <w:rFonts w:ascii="Lato" w:hAnsi="Lato" w:cs="Lato"/>
+          <w:b w:val="0"/>
+          <w:i w:val="0"/>
+          <w:color w:val="46566B"/>
+          <w:sz w:val="20"/>
+        </w:rPr>
+        <w:t>______________     →     Lanzamiento estimado: ~6 semanas después.</w:t>
+      </w:r>
     </w:p>
     <w:p>
       <w:pPr>
@@ -1247,13 +2662,13 @@
           <w:color w:val="46566B"/>
           <w:sz w:val="20"/>
         </w:rPr>
-        <w:t>cotizaciones que terminan en pago, minutos de atención por pedido, entregas a tiempo y reseñas conseguidas. No prometemos porcentajes de venta antes de tener datos reales.</w:t>
+        <w:t>cotizaciones que terminan en pago, minutos de atención por pedido, entregas a tiempo y reseñas conseguidas. Los resultados de venta se miden después de lanzar, con datos reales; no prometemos porcentajes por adelantado.</w:t>
       </w:r>
     </w:p>
     <w:p>
       <w:pPr>
         <w:keepNext/>
-        <w:spacing w:before="320" w:after="160"/>
+        <w:spacing w:before="300" w:after="140"/>
         <w:pBdr>
           <w:bottom w:val="single" w:sz="10" w:space="4" w:color="E3EBF4"/>
         </w:pBdr>
@@ -1264,9 +2679,9 @@
           <w:b/>
           <w:i w:val="0"/>
           <w:color w:val="00C2FF"/>
-          <w:sz w:val="28"/>
+          <w:sz w:val="27"/>
         </w:rPr>
-        <w:t xml:space="preserve">5  </w:t>
+        <w:t xml:space="preserve">7  </w:t>
       </w:r>
       <w:r>
         <w:rPr>
@@ -1274,14 +2689,14 @@
           <w:b/>
           <w:i w:val="0"/>
           <w:color w:val="0A74DA"/>
-          <w:sz w:val="28"/>
+          <w:sz w:val="27"/>
         </w:rPr>
-        <w:t>Lo que necesitamos de ti (5 preguntas)</w:t>
+        <w:t>Lo que necesitamos de ti</w:t>
       </w:r>
     </w:p>
     <w:p>
       <w:pPr>
-        <w:spacing w:after="160" w:before="0" w:line="276" w:lineRule="auto"/>
+        <w:spacing w:after="120" w:before="0" w:line="276" w:lineRule="auto"/>
       </w:pPr>
       <w:r>
         <w:rPr>
@@ -1291,7 +2706,7 @@
           <w:color w:val="46566B"/>
           <w:sz w:val="21"/>
         </w:rPr>
-        <w:t>Para hacerte una propuesta con números reales —y no inventados— necesitamos saber:</w:t>
+        <w:t>Para hacerte una propuesta con números reales —y no inventados—:</w:t>
       </w:r>
     </w:p>
     <w:p>
@@ -1369,7 +2784,7 @@
           <w:color w:val="46566B"/>
           <w:sz w:val="21"/>
         </w:rPr>
-        <w:t>Precios y, de ser posible, el margen de tus principales productos (por ejemplo, juegos de sellos vs. pines).</w:t>
+        <w:t>Precios y, de ser posible, el margen de tus principales productos (juegos de sellos vs. pines).</w:t>
       </w:r>
     </w:p>
     <w:p>
@@ -1426,8 +2841,101 @@
     </w:p>
     <w:p>
       <w:pPr>
+        <w:spacing w:after="80" w:before="120" w:line="276" w:lineRule="auto"/>
+      </w:pPr>
+      <w:r>
+        <w:rPr>
+          <w:rFonts w:ascii="Lato" w:hAnsi="Lato" w:cs="Lato"/>
+          <w:b/>
+          <w:i w:val="0"/>
+          <w:color w:val="0E1B2C"/>
+          <w:sz w:val="21"/>
+        </w:rPr>
+        <w:t>Y para la marca y las redes:</w:t>
+      </w:r>
+    </w:p>
+    <w:p>
+      <w:pPr>
+        <w:spacing w:after="100" w:line="269" w:lineRule="auto"/>
+        <w:ind w:left="227"/>
+      </w:pPr>
+      <w:r>
+        <w:rPr>
+          <w:rFonts w:ascii="Lato" w:hAnsi="Lato" w:cs="Lato"/>
+          <w:b/>
+          <w:i w:val="0"/>
+          <w:color w:val="46566B"/>
+          <w:sz w:val="21"/>
+        </w:rPr>
+        <w:t xml:space="preserve">— </w:t>
+      </w:r>
+      <w:r>
+        <w:rPr>
+          <w:rFonts w:ascii="Lato" w:hAnsi="Lato" w:cs="Lato"/>
+          <w:b w:val="0"/>
+          <w:i w:val="0"/>
+          <w:color w:val="46566B"/>
+          <w:sz w:val="21"/>
+        </w:rPr>
+        <w:t>¿Tienes tu logotipo en vector (archivos .ai, .svg, .pdf o .eps)?</w:t>
+      </w:r>
+    </w:p>
+    <w:p>
+      <w:pPr>
+        <w:spacing w:after="100" w:line="269" w:lineRule="auto"/>
+        <w:ind w:left="227"/>
+      </w:pPr>
+      <w:r>
+        <w:rPr>
+          <w:rFonts w:ascii="Lato" w:hAnsi="Lato" w:cs="Lato"/>
+          <w:b/>
+          <w:i w:val="0"/>
+          <w:color w:val="46566B"/>
+          <w:sz w:val="21"/>
+        </w:rPr>
+        <w:t xml:space="preserve">— </w:t>
+      </w:r>
+      <w:r>
+        <w:rPr>
+          <w:rFonts w:ascii="Lato" w:hAnsi="Lato" w:cs="Lato"/>
+          <w:b w:val="0"/>
+          <w:i w:val="0"/>
+          <w:color w:val="46566B"/>
+          <w:sz w:val="21"/>
+        </w:rPr>
+        <w:t>¿Qué redes tienes activas además de Facebook (Instagram, TikTok, Google)?</w:t>
+      </w:r>
+    </w:p>
+    <w:p>
+      <w:pPr>
+        <w:spacing w:after="100" w:line="269" w:lineRule="auto"/>
+        <w:ind w:left="227"/>
+      </w:pPr>
+      <w:r>
+        <w:rPr>
+          <w:rFonts w:ascii="Lato" w:hAnsi="Lato" w:cs="Lato"/>
+          <w:b/>
+          <w:i w:val="0"/>
+          <w:color w:val="46566B"/>
+          <w:sz w:val="21"/>
+        </w:rPr>
+        <w:t xml:space="preserve">— </w:t>
+      </w:r>
+      <w:r>
+        <w:rPr>
+          <w:rFonts w:ascii="Lato" w:hAnsi="Lato" w:cs="Lato"/>
+          <w:b w:val="0"/>
+          <w:i w:val="0"/>
+          <w:color w:val="46566B"/>
+          <w:sz w:val="21"/>
+        </w:rPr>
+        <w:t>Accesos o nombres de usuario para unificar los perfiles.</w:t>
+      </w:r>
+    </w:p>
+    <w:p>
+      <w:pPr>
         <w:keepNext/>
-        <w:spacing w:before="320" w:after="160"/>
+        <w:spacing w:before="300" w:after="140"/>
         <w:pBdr>
           <w:bottom w:val="single" w:sz="10" w:space="4" w:color="E3EBF4"/>
         </w:pBdr>
@@ -1438,9 +2946,9 @@
           <w:b/>
           <w:i w:val="0"/>
           <w:color w:val="00C2FF"/>
-          <w:sz w:val="28"/>
+          <w:sz w:val="27"/>
         </w:rPr>
-        <w:t xml:space="preserve">6  </w:t>
+        <w:t xml:space="preserve">8  </w:t>
       </w:r>
       <w:r>
         <w:rPr>
@@ -1448,7 +2956,7 @@
           <w:b/>
           <w:i w:val="0"/>
           <w:color w:val="0A74DA"/>
-          <w:sz w:val="28"/>
+          <w:sz w:val="27"/>
         </w:rPr>
         <w:t>Inversión (con transparencia)</w:t>
       </w:r>
@@ -1465,7 +2973,7 @@
           <w:color w:val="46566B"/>
           <w:sz w:val="21"/>
         </w:rPr>
-        <w:t>Separamos los costos para que veas claramente en qué se va cada peso. El precio de Aimarktech cubre nuestro trabajo; el dominio, el alojamiento, las comisiones de pago y la publicidad se cotizan y pagan aparte.</w:t>
+        <w:t>Separamos los costos para que veas en qué se va cada peso. El precio de Aimarktech cubre nuestro trabajo; el dominio, el alojamiento, las comisiones de pago y la publicidad se cotizan y pagan aparte.</w:t>
       </w:r>
     </w:p>
     <w:tbl>
@@ -1489,7 +2997,7 @@
       <w:tr>
         <w:tc>
           <w:tcPr>
-            <w:tcW w:type="dxa" w:w="3789"/>
+            <w:tcW w:type="dxa" w:w="3390"/>
             <w:shd w:val="clear" w:color="auto" w:fill="0A74DA"/>
             <w:tcMar>
               <w:top w:w="100" w:type="dxa"/>
@@ -1508,7 +3016,7 @@
                 <w:b/>
                 <w:i w:val="0"/>
                 <w:color w:val="FFFFFF"/>
-                <w:sz w:val="20"/>
+                <w:sz w:val="19"/>
               </w:rPr>
               <w:t>Concepto</w:t>
             </w:r>
@@ -1516,7 +3024,7 @@
         </w:tc>
         <w:tc>
           <w:tcPr>
-            <w:tcW w:type="dxa" w:w="6183"/>
+            <w:tcW w:type="dxa" w:w="6582"/>
             <w:shd w:val="clear" w:color="auto" w:fill="0A74DA"/>
             <w:tcMar>
               <w:top w:w="100" w:type="dxa"/>
@@ -1535,7 +3043,7 @@
                 <w:b/>
                 <w:i w:val="0"/>
                 <w:color w:val="FFFFFF"/>
-                <w:sz w:val="20"/>
+                <w:sz w:val="19"/>
               </w:rPr>
               <w:t>Detalle</w:t>
             </w:r>
@@ -1545,7 +3053,7 @@
       <w:tr>
         <w:tc>
           <w:tcPr>
-            <w:tcW w:type="dxa" w:w="3789"/>
+            <w:tcW w:type="dxa" w:w="3390"/>
             <w:shd w:val="clear" w:color="auto" w:fill="FFFFFF"/>
             <w:tcMar>
               <w:top w:w="100" w:type="dxa"/>
@@ -1564,7 +3072,7 @@
                 <w:b/>
                 <w:i w:val="0"/>
                 <w:color w:val="0E1B2C"/>
-                <w:sz w:val="20"/>
+                <w:sz w:val="19"/>
               </w:rPr>
               <w:t>Servicios Aimarktech (mensual)</w:t>
             </w:r>
@@ -1572,7 +3080,7 @@
         </w:tc>
         <w:tc>
           <w:tcPr>
-            <w:tcW w:type="dxa" w:w="6183"/>
+            <w:tcW w:type="dxa" w:w="6582"/>
             <w:shd w:val="clear" w:color="auto" w:fill="FFFFFF"/>
             <w:tcMar>
               <w:top w:w="100" w:type="dxa"/>
@@ -1591,7 +3099,7 @@
                 <w:b w:val="0"/>
                 <w:i w:val="0"/>
                 <w:color w:val="46566B"/>
-                <w:sz w:val="20"/>
+                <w:sz w:val="19"/>
               </w:rPr>
               <w:t>Acompañamiento, implementación y ajustes. Planes desde $2,500 (Esencial); $3,500 Crecimiento (recomendado).</w:t>
             </w:r>
@@ -1601,7 +3109,7 @@
       <w:tr>
         <w:tc>
           <w:tcPr>
-            <w:tcW w:type="dxa" w:w="3789"/>
+            <w:tcW w:type="dxa" w:w="3390"/>
             <w:shd w:val="clear" w:color="auto" w:fill="F4F8FD"/>
             <w:tcMar>
               <w:top w:w="100" w:type="dxa"/>
@@ -1620,15 +3128,15 @@
                 <w:b/>
                 <w:i w:val="0"/>
                 <w:color w:val="0E1B2C"/>
-                <w:sz w:val="20"/>
+                <w:sz w:val="19"/>
               </w:rPr>
-              <w:t>Desarrollo inicial de la tienda (una vez)</w:t>
+              <w:t>Kit de marca (si hace falta)</w:t>
             </w:r>
           </w:p>
         </w:tc>
         <w:tc>
           <w:tcPr>
-            <w:tcW w:type="dxa" w:w="6183"/>
+            <w:tcW w:type="dxa" w:w="6582"/>
             <w:shd w:val="clear" w:color="auto" w:fill="F4F8FD"/>
             <w:tcMar>
               <w:top w:w="100" w:type="dxa"/>
@@ -1647,9 +3155,9 @@
                 <w:b w:val="0"/>
                 <w:i w:val="0"/>
                 <w:color w:val="46566B"/>
-                <w:sz w:val="20"/>
+                <w:sz w:val="19"/>
               </w:rPr>
-              <w:t>Se cotiza al terminar la Etapa 1, cuando conozcamos el catálogo y el alcance real.</w:t>
+              <w:t>Diseño o adaptación de logo e identidad para web. Se cotiza según lo que ya tengas.</w:t>
             </w:r>
           </w:p>
         </w:tc>
@@ -1657,7 +3165,7 @@
       <w:tr>
         <w:tc>
           <w:tcPr>
-            <w:tcW w:type="dxa" w:w="3789"/>
+            <w:tcW w:type="dxa" w:w="3390"/>
             <w:shd w:val="clear" w:color="auto" w:fill="FFFFFF"/>
             <w:tcMar>
               <w:top w:w="100" w:type="dxa"/>
@@ -1676,15 +3184,15 @@
                 <w:b/>
                 <w:i w:val="0"/>
                 <w:color w:val="0E1B2C"/>
-                <w:sz w:val="20"/>
+                <w:sz w:val="19"/>
               </w:rPr>
-              <w:t>Servicios externos</w:t>
+              <w:t>Desarrollo inicial de la tienda (una vez)</w:t>
             </w:r>
           </w:p>
         </w:tc>
         <w:tc>
           <w:tcPr>
-            <w:tcW w:type="dxa" w:w="6183"/>
+            <w:tcW w:type="dxa" w:w="6582"/>
             <w:shd w:val="clear" w:color="auto" w:fill="FFFFFF"/>
             <w:tcMar>
               <w:top w:w="100" w:type="dxa"/>
@@ -1703,9 +3211,9 @@
                 <w:b w:val="0"/>
                 <w:i w:val="0"/>
                 <w:color w:val="46566B"/>
-                <w:sz w:val="20"/>
+                <w:sz w:val="19"/>
               </w:rPr>
-              <w:t>Dominio (~$200–400 MXN/año), alojamiento en Cloudflare (desde $0) y correo.</w:t>
+              <w:t>Se cotiza al terminar la Etapa 1, cuando conozcamos catálogo y alcance real.</w:t>
             </w:r>
           </w:p>
         </w:tc>
@@ -1713,7 +3221,7 @@
       <w:tr>
         <w:tc>
           <w:tcPr>
-            <w:tcW w:type="dxa" w:w="3789"/>
+            <w:tcW w:type="dxa" w:w="3390"/>
             <w:shd w:val="clear" w:color="auto" w:fill="F4F8FD"/>
             <w:tcMar>
               <w:top w:w="100" w:type="dxa"/>
@@ -1732,15 +3240,15 @@
                 <w:b/>
                 <w:i w:val="0"/>
                 <w:color w:val="0E1B2C"/>
-                <w:sz w:val="20"/>
+                <w:sz w:val="19"/>
               </w:rPr>
-              <w:t>Comisiones de pago (si eliges Opción 2)</w:t>
+              <w:t>Servicios externos</w:t>
             </w:r>
           </w:p>
         </w:tc>
         <w:tc>
           <w:tcPr>
-            <w:tcW w:type="dxa" w:w="6183"/>
+            <w:tcW w:type="dxa" w:w="6582"/>
             <w:shd w:val="clear" w:color="auto" w:fill="F4F8FD"/>
             <w:tcMar>
               <w:top w:w="100" w:type="dxa"/>
@@ -1759,9 +3267,9 @@
                 <w:b w:val="0"/>
                 <w:i w:val="0"/>
                 <w:color w:val="46566B"/>
-                <w:sz w:val="20"/>
+                <w:sz w:val="19"/>
               </w:rPr>
-              <w:t>≈ 3.6% + $3 MXN + IVA por transacción. Crecen con las ventas; las cobra la pasarela, no Aimarktech.</w:t>
+              <w:t>Dominio (~$200–400 MXN/año), alojamiento (desde $0) y correo.</w:t>
             </w:r>
           </w:p>
         </w:tc>
@@ -1769,7 +3277,7 @@
       <w:tr>
         <w:tc>
           <w:tcPr>
-            <w:tcW w:type="dxa" w:w="3789"/>
+            <w:tcW w:type="dxa" w:w="3390"/>
             <w:shd w:val="clear" w:color="auto" w:fill="FFFFFF"/>
             <w:tcMar>
               <w:top w:w="100" w:type="dxa"/>
@@ -1788,15 +3296,15 @@
                 <w:b/>
                 <w:i w:val="0"/>
                 <w:color w:val="0E1B2C"/>
-                <w:sz w:val="20"/>
+                <w:sz w:val="19"/>
               </w:rPr>
-              <w:t>Pauta publicitaria (opcional)</w:t>
+              <w:t>Comisiones de pago (Opción 2)</w:t>
             </w:r>
           </w:p>
         </w:tc>
         <w:tc>
           <w:tcPr>
-            <w:tcW w:type="dxa" w:w="6183"/>
+            <w:tcW w:type="dxa" w:w="6582"/>
             <w:shd w:val="clear" w:color="auto" w:fill="FFFFFF"/>
             <w:tcMar>
               <w:top w:w="100" w:type="dxa"/>
@@ -1815,7 +3323,63 @@
                 <w:b w:val="0"/>
                 <w:i w:val="0"/>
                 <w:color w:val="46566B"/>
-                <w:sz w:val="20"/>
+                <w:sz w:val="19"/>
+              </w:rPr>
+              <w:t>≈ 3.6% + $3 MXN + IVA por transacción. Crecen con las ventas; las cobra la pasarela, no Aimarktech.</w:t>
+            </w:r>
+          </w:p>
+        </w:tc>
+      </w:tr>
+      <w:tr>
+        <w:tc>
+          <w:tcPr>
+            <w:tcW w:type="dxa" w:w="3390"/>
+            <w:shd w:val="clear" w:color="auto" w:fill="F4F8FD"/>
+            <w:tcMar>
+              <w:top w:w="100" w:type="dxa"/>
+              <w:bottom w:w="100" w:type="dxa"/>
+              <w:start w:w="140" w:type="dxa"/>
+              <w:end w:w="140" w:type="dxa"/>
+              <w:left w:w="140" w:type="dxa"/>
+              <w:right w:w="140" w:type="dxa"/>
+            </w:tcMar>
+          </w:tcPr>
+          <w:p>
+            <w:r/>
+            <w:r>
+              <w:rPr>
+                <w:rFonts w:ascii="Lato" w:hAnsi="Lato" w:cs="Lato"/>
+                <w:b/>
+                <w:i w:val="0"/>
+                <w:color w:val="0E1B2C"/>
+                <w:sz w:val="19"/>
+              </w:rPr>
+              <w:t>Pauta publicitaria (opcional)</w:t>
+            </w:r>
+          </w:p>
+        </w:tc>
+        <w:tc>
+          <w:tcPr>
+            <w:tcW w:type="dxa" w:w="6582"/>
+            <w:shd w:val="clear" w:color="auto" w:fill="F4F8FD"/>
+            <w:tcMar>
+              <w:top w:w="100" w:type="dxa"/>
+              <w:bottom w:w="100" w:type="dxa"/>
+              <w:start w:w="140" w:type="dxa"/>
+              <w:end w:w="140" w:type="dxa"/>
+              <w:left w:w="140" w:type="dxa"/>
+              <w:right w:w="140" w:type="dxa"/>
+            </w:tcMar>
+          </w:tcPr>
+          <w:p>
+            <w:r/>
+            <w:r>
+              <w:rPr>
+                <w:rFonts w:ascii="Lato" w:hAnsi="Lato" w:cs="Lato"/>
+                <w:b w:val="0"/>
+                <w:i w:val="0"/>
+                <w:color w:val="46566B"/>
+                <w:sz w:val="19"/>
               </w:rPr>
               <w:t>Ajustable mes con mes; se invierte 100% en la plataforma de anuncios.</w:t>
             </w:r>
@@ -1827,31 +3391,6 @@
       <w:pPr>
         <w:spacing w:after="40" w:before="0" w:line="276" w:lineRule="auto"/>
       </w:pPr>
-    </w:p>
-    <w:p>
-      <w:pPr>
-        <w:spacing w:after="120" w:before="0" w:line="276" w:lineRule="auto"/>
-      </w:pPr>
-      <w:r>
-        <w:rPr>
-          <w:rFonts w:ascii="Lato" w:hAnsi="Lato" w:cs="Lato"/>
-          <w:b/>
-          <w:i w:val="0"/>
-          <w:color w:val="0E1B2C"/>
-          <w:sz w:val="20"/>
-        </w:rPr>
-        <w:t xml:space="preserve">¿Por qué tienda propia y no Shopify?  </w:t>
-      </w:r>
-      <w:r>
-        <w:rPr>
-          <w:rFonts w:ascii="Lato" w:hAnsi="Lato" w:cs="Lato"/>
-          <w:b w:val="0"/>
-          <w:i w:val="0"/>
-          <w:color w:val="46566B"/>
-          <w:sz w:val="20"/>
-        </w:rPr>
-        <w:t>Una plataforma rentada cuesta poco al mes, pero te ata a sus reglas y comisiones. Tu tienda propia es tuya, se adapta a tu forma de vender (personalizados y anticipos) y crece contigo. Si prefieres arrancar en una plataforma rentada, también lo evaluamos contigo.</w:t>
-      </w:r>
     </w:p>
     <w:p>
       <w:pPr>
@@ -1881,7 +3420,7 @@
     <w:p>
       <w:pPr>
         <w:keepNext/>
-        <w:spacing w:before="320" w:after="160"/>
+        <w:spacing w:before="300" w:after="140"/>
         <w:pBdr>
           <w:bottom w:val="single" w:sz="10" w:space="4" w:color="E3EBF4"/>
         </w:pBdr>
@@ -1892,9 +3431,9 @@
           <w:b/>
           <w:i w:val="0"/>
           <w:color w:val="00C2FF"/>
-          <w:sz w:val="28"/>
+          <w:sz w:val="27"/>
         </w:rPr>
-        <w:t xml:space="preserve">7  </w:t>
+        <w:t xml:space="preserve">9  </w:t>
       </w:r>
       <w:r>
         <w:rPr>
@@ -1902,7 +3441,216 @@
           <w:b/>
           <w:i w:val="0"/>
           <w:color w:val="0A74DA"/>
-          <w:sz w:val="28"/>
+          <w:sz w:val="27"/>
+        </w:rPr>
+        <w:t>Qué gana Metales Infinity</w:t>
+      </w:r>
+    </w:p>
+    <w:p>
+      <w:pPr>
+        <w:spacing w:after="100" w:line="269" w:lineRule="auto"/>
+        <w:ind w:left="227"/>
+      </w:pPr>
+      <w:r>
+        <w:rPr>
+          <w:rFonts w:ascii="Lato" w:hAnsi="Lato" w:cs="Lato"/>
+          <w:b/>
+          <w:i w:val="0"/>
+          <w:color w:val="0A74DA"/>
+          <w:sz w:val="21"/>
+        </w:rPr>
+        <w:t xml:space="preserve">⏱ </w:t>
+      </w:r>
+      <w:r>
+        <w:rPr>
+          <w:rFonts w:ascii="Lato" w:hAnsi="Lato" w:cs="Lato"/>
+          <w:b/>
+          <w:i w:val="0"/>
+          <w:color w:val="0E1B2C"/>
+          <w:sz w:val="21"/>
+        </w:rPr>
+        <w:t xml:space="preserve">Tiempo. </w:t>
+      </w:r>
+      <w:r>
+        <w:rPr>
+          <w:rFonts w:ascii="Lato" w:hAnsi="Lato" w:cs="Lato"/>
+          <w:b w:val="0"/>
+          <w:i w:val="0"/>
+          <w:color w:val="46566B"/>
+          <w:sz w:val="21"/>
+        </w:rPr>
+        <w:t>Recuperas horas hoy perdidas en el celular (lo medimos antes y después).</w:t>
+      </w:r>
+    </w:p>
+    <w:p>
+      <w:pPr>
+        <w:spacing w:after="100" w:line="269" w:lineRule="auto"/>
+        <w:ind w:left="227"/>
+      </w:pPr>
+      <w:r>
+        <w:rPr>
+          <w:rFonts w:ascii="Lato" w:hAnsi="Lato" w:cs="Lato"/>
+          <w:b/>
+          <w:i w:val="0"/>
+          <w:color w:val="0A74DA"/>
+          <w:sz w:val="21"/>
+        </w:rPr>
+        <w:t xml:space="preserve">📈 </w:t>
+      </w:r>
+      <w:r>
+        <w:rPr>
+          <w:rFonts w:ascii="Lato" w:hAnsi="Lato" w:cs="Lato"/>
+          <w:b/>
+          <w:i w:val="0"/>
+          <w:color w:val="0E1B2C"/>
+          <w:sz w:val="21"/>
+        </w:rPr>
+        <w:t xml:space="preserve">Menos meses flojos. </w:t>
+      </w:r>
+      <w:r>
+        <w:rPr>
+          <w:rFonts w:ascii="Lato" w:hAnsi="Lato" w:cs="Lato"/>
+          <w:b w:val="0"/>
+          <w:i w:val="0"/>
+          <w:color w:val="46566B"/>
+          <w:sz w:val="21"/>
+        </w:rPr>
+        <w:t>Aprovechas la capacidad que ya tienes, con una vitrina que trabaja sola.</w:t>
+      </w:r>
+    </w:p>
+    <w:p>
+      <w:pPr>
+        <w:spacing w:after="100" w:line="269" w:lineRule="auto"/>
+        <w:ind w:left="227"/>
+      </w:pPr>
+      <w:r>
+        <w:rPr>
+          <w:rFonts w:ascii="Lato" w:hAnsi="Lato" w:cs="Lato"/>
+          <w:b/>
+          <w:i w:val="0"/>
+          <w:color w:val="0A74DA"/>
+          <w:sz w:val="21"/>
+        </w:rPr>
+        <w:t xml:space="preserve">🔁 </w:t>
+      </w:r>
+      <w:r>
+        <w:rPr>
+          <w:rFonts w:ascii="Lato" w:hAnsi="Lato" w:cs="Lato"/>
+          <w:b/>
+          <w:i w:val="0"/>
+          <w:color w:val="0E1B2C"/>
+          <w:sz w:val="21"/>
+        </w:rPr>
+        <w:t xml:space="preserve">Clientes que regresan. </w:t>
+      </w:r>
+      <w:r>
+        <w:rPr>
+          <w:rFonts w:ascii="Lato" w:hAnsi="Lato" w:cs="Lato"/>
+          <w:b w:val="0"/>
+          <w:i w:val="0"/>
+          <w:color w:val="46566B"/>
+          <w:sz w:val="21"/>
+        </w:rPr>
+        <w:t>Con seguimiento a tus recompras (pines y sellos), no de memoria.</w:t>
+      </w:r>
+    </w:p>
+    <w:p>
+      <w:pPr>
+        <w:spacing w:after="100" w:line="269" w:lineRule="auto"/>
+        <w:ind w:left="227"/>
+      </w:pPr>
+      <w:r>
+        <w:rPr>
+          <w:rFonts w:ascii="Lato" w:hAnsi="Lato" w:cs="Lato"/>
+          <w:b/>
+          <w:i w:val="0"/>
+          <w:color w:val="0A74DA"/>
+          <w:sz w:val="21"/>
+        </w:rPr>
+        <w:t xml:space="preserve">🧠 </w:t>
+      </w:r>
+      <w:r>
+        <w:rPr>
+          <w:rFonts w:ascii="Lato" w:hAnsi="Lato" w:cs="Lato"/>
+          <w:b/>
+          <w:i w:val="0"/>
+          <w:color w:val="0E1B2C"/>
+          <w:sz w:val="21"/>
+        </w:rPr>
+        <w:t xml:space="preserve">Enfoque. </w:t>
+      </w:r>
+      <w:r>
+        <w:rPr>
+          <w:rFonts w:ascii="Lato" w:hAnsi="Lato" w:cs="Lato"/>
+          <w:b w:val="0"/>
+          <w:i w:val="0"/>
+          <w:color w:val="46566B"/>
+          <w:sz w:val="21"/>
+        </w:rPr>
+        <w:t>Tiempo para crear piezas nuevas y dirigir tu negocio.</w:t>
+      </w:r>
+    </w:p>
+    <w:p>
+      <w:pPr>
+        <w:spacing w:after="100" w:line="269" w:lineRule="auto"/>
+        <w:ind w:left="227"/>
+      </w:pPr>
+      <w:r>
+        <w:rPr>
+          <w:rFonts w:ascii="Lato" w:hAnsi="Lato" w:cs="Lato"/>
+          <w:b/>
+          <w:i w:val="0"/>
+          <w:color w:val="0A74DA"/>
+          <w:sz w:val="21"/>
+        </w:rPr>
+        <w:t xml:space="preserve">🌎 </w:t>
+      </w:r>
+      <w:r>
+        <w:rPr>
+          <w:rFonts w:ascii="Lato" w:hAnsi="Lato" w:cs="Lato"/>
+          <w:b/>
+          <w:i w:val="0"/>
+          <w:color w:val="0E1B2C"/>
+          <w:sz w:val="21"/>
+        </w:rPr>
+        <w:t xml:space="preserve">Base para crecer. </w:t>
+      </w:r>
+      <w:r>
+        <w:rPr>
+          <w:rFonts w:ascii="Lato" w:hAnsi="Lato" w:cs="Lato"/>
+          <w:b w:val="0"/>
+          <w:i w:val="0"/>
+          <w:color w:val="46566B"/>
+          <w:sz w:val="21"/>
+        </w:rPr>
+        <w:t>Un camino claro hacia México y EE.UU. con una marca reconocible.</w:t>
+      </w:r>
+    </w:p>
+    <w:p>
+      <w:pPr>
+        <w:keepNext/>
+        <w:spacing w:before="300" w:after="140"/>
+        <w:pBdr>
+          <w:bottom w:val="single" w:sz="10" w:space="4" w:color="E3EBF4"/>
+        </w:pBdr>
+      </w:pPr>
+      <w:r>
+        <w:rPr>
+          <w:rFonts w:ascii="Montserrat" w:hAnsi="Montserrat" w:cs="Montserrat"/>
+          <w:b/>
+          <w:i w:val="0"/>
+          <w:color w:val="00C2FF"/>
+          <w:sz w:val="27"/>
+        </w:rPr>
+        <w:t xml:space="preserve">10  </w:t>
+      </w:r>
+      <w:r>
+        <w:rPr>
+          <w:rFonts w:ascii="Montserrat" w:hAnsi="Montserrat" w:cs="Montserrat"/>
+          <w:b/>
+          <w:i w:val="0"/>
+          <w:color w:val="0A74DA"/>
+          <w:sz w:val="27"/>
         </w:rPr>
         <w:t>Por qué Aimarktech</w:t>
       </w:r>
@@ -2054,7 +3802,7 @@
     <w:p>
       <w:pPr>
         <w:keepNext/>
-        <w:spacing w:before="320" w:after="160"/>
+        <w:spacing w:before="300" w:after="140"/>
         <w:pBdr>
           <w:bottom w:val="single" w:sz="10" w:space="4" w:color="E3EBF4"/>
         </w:pBdr>
@@ -2065,9 +3813,9 @@
           <w:b/>
           <w:i w:val="0"/>
           <w:color w:val="00C2FF"/>
-          <w:sz w:val="28"/>
+          <w:sz w:val="27"/>
         </w:rPr>
-        <w:t xml:space="preserve">8  </w:t>
+        <w:t xml:space="preserve">11  </w:t>
       </w:r>
       <w:r>
         <w:rPr>
@@ -2075,7 +3823,7 @@
           <w:b/>
           <w:i w:val="0"/>
           <w:color w:val="0A74DA"/>
-          <w:sz w:val="28"/>
+          <w:sz w:val="27"/>
         </w:rPr>
         <w:t>Siguientes pasos</w:t>
       </w:r>
@@ -2129,7 +3877,7 @@
           <w:color w:val="46566B"/>
           <w:sz w:val="21"/>
         </w:rPr>
-        <w:t>Una llamada corta para responder las 5 preguntas.</w:t>
+        <w:t>Una llamada corta (20 min) para responder las preguntas y fijar la fecha de inicio.</w:t>
       </w:r>
     </w:p>
     <w:p>
@@ -2155,7 +3903,7 @@
           <w:color w:val="46566B"/>
           <w:sz w:val="21"/>
         </w:rPr>
-        <w:t>Iniciamos la Etapa 1 (definición) y te entregamos el plan detallado.</w:t>
+        <w:t>Iniciamos la Etapa 0 (marca y bases) y te entregamos el calendario con fechas exactas.</w:t>
       </w:r>
     </w:p>
     <w:tbl>
@@ -2329,13 +4077,13 @@
           <w:color w:val="0A74DA"/>
           <w:sz w:val="21"/>
         </w:rPr>
-        <w:t>Empecemos con información, no con presión: primero ordenamos, luego crecemos.</w:t>
+        <w:t>“Primero trabajamos en el empresario, después en el negocio.”</w:t>
       </w:r>
     </w:p>
     <w:sectPr>
       <w:footerReference w:type="default" r:id="rId9"/>
       <w:pgSz w:w="12240" w:h="15840"/>
-      <w:pgMar w:top="1077" w:right="1134" w:bottom="1077" w:left="1134" w:header="720" w:footer="720" w:gutter="0"/>
+      <w:pgMar w:top="1020" w:right="1134" w:bottom="1020" w:left="1134" w:header="720" w:footer="720" w:gutter="0"/>
       <w:cols w:space="720"/>
       <w:docGrid w:linePitch="360"/>
     </w:sectPr>
@@ -2358,7 +4106,7 @@
         <w:color w:val="46566B"/>
         <w:sz w:val="16"/>
       </w:rPr>
-      <w:t>Aimarktech  ·  Propuesta para Metales Infinity  ·  Confidencial</w:t>
+      <w:t>Aimarktech  ·  Propuesta para Metales Infinity  ·  Documento confidencial</w:t>
     </w:r>
   </w:p>
 </w:ftr>

</xml_diff>